<commit_message>
chore: merge branch "main"
Conflicts: many
</commit_message>
<xml_diff>
--- a/public/documents/TEMPLATE_Dokumentation_der_Digitaltauglichkeit.docx
+++ b/public/documents/TEMPLATE_Dokumentation_der_Digitaltauglichkeit.docx
@@ -24,11 +24,12 @@
     <w:p>
       <w:pPr>
         <w:pStyle w:val="Normal0"/>
-        <w:rPr/>
-      </w:pPr>
-      <w:r>
-        <w:rPr>
-          <w:rStyle w:val="NoneA"/>
+        <w:rPr>
+          <w:lang w:val="de-DE"/>
+        </w:rPr>
+      </w:pPr>
+      <w:r>
+        <w:rPr>
           <w:lang w:val="de-DE"/>
         </w:rPr>
         <w:t>Die Dokumentation der Digitaltauglichkeit ist ein formeller, letzter Schritt. Sie dokumentieren, auf welche Aspekte der Digitaltauglichkeit Sie besonders geachtet haben, und wie diese in das Regelungsvorhaben eingeflossen sind.</w:t>
@@ -38,7 +39,7 @@
       <w:tblPr>
         <w:tblW w:w="9072" w:type="dxa"/>
         <w:jc w:val="start"/>
-        <w:tblInd w:w="756" w:type="dxa"/>
+        <w:tblInd w:w="648" w:type="dxa"/>
         <w:tblLayout w:type="fixed"/>
         <w:tblCellMar>
           <w:top w:w="80" w:type="dxa"/>
@@ -59,12 +60,12 @@
           <w:tcPr>
             <w:tcW w:w="5315" w:type="dxa"/>
             <w:tcBorders/>
-            <w:shd w:color="auto" w:fill="auto" w:val="clear"/>
           </w:tcPr>
           <w:p>
             <w:pPr>
               <w:pStyle w:val="Heading2"/>
               <w:spacing w:before="360" w:after="120"/>
+              <w:ind w:hanging="0" w:start="0" w:end="0"/>
               <w:rPr>
                 <w:shd w:fill="auto" w:val="clear"/>
               </w:rPr>
@@ -287,14 +288,14 @@
           <w:tcPr>
             <w:tcW w:w="3757" w:type="dxa"/>
             <w:tcBorders/>
-            <w:shd w:color="auto" w:fill="FFF9D2" w:val="clear"/>
+            <w:shd w:fill="FFF9D2" w:val="clear"/>
           </w:tcPr>
           <w:p>
             <w:pPr>
               <w:pStyle w:val="Heading2"/>
               <w:spacing w:lineRule="auto" w:line="276" w:before="360" w:after="120"/>
+              <w:ind w:hanging="0" w:start="0" w:end="0"/>
               <w:rPr>
-                <w:rStyle w:val="None"/>
                 <w:shd w:fill="auto" w:val="clear"/>
               </w:rPr>
             </w:pPr>
@@ -315,7 +316,6 @@
               <w:ind w:hanging="0" w:start="0" w:end="0"/>
               <w:jc w:val="start"/>
               <w:rPr>
-                <w:rStyle w:val="None"/>
                 <w:sz w:val="16"/>
                 <w:szCs w:val="16"/>
                 <w:shd w:fill="auto" w:val="clear"/>
@@ -340,7 +340,6 @@
               <w:ind w:hanging="0" w:start="0" w:end="0"/>
               <w:jc w:val="start"/>
               <w:rPr>
-                <w:rStyle w:val="None"/>
                 <w:sz w:val="16"/>
                 <w:szCs w:val="16"/>
                 <w:shd w:fill="auto" w:val="clear"/>
@@ -365,7 +364,6 @@
               <w:ind w:hanging="0" w:start="0" w:end="0"/>
               <w:jc w:val="start"/>
               <w:rPr>
-                <w:rStyle w:val="None"/>
                 <w:sz w:val="16"/>
                 <w:szCs w:val="16"/>
                 <w:shd w:fill="auto" w:val="clear"/>
@@ -390,7 +388,6 @@
               <w:ind w:hanging="0" w:start="0" w:end="0"/>
               <w:jc w:val="start"/>
               <w:rPr>
-                <w:rStyle w:val="None"/>
                 <w:sz w:val="16"/>
                 <w:szCs w:val="16"/>
                 <w:shd w:fill="auto" w:val="clear"/>
@@ -415,7 +412,6 @@
               <w:ind w:hanging="0" w:start="0" w:end="0"/>
               <w:jc w:val="start"/>
               <w:rPr>
-                <w:rStyle w:val="None"/>
                 <w:sz w:val="16"/>
                 <w:szCs w:val="16"/>
                 <w:shd w:fill="auto" w:val="clear"/>
@@ -462,18 +458,6 @@
         <w:pStyle w:val="Normal0"/>
         <w:widowControl w:val="false"/>
         <w:spacing w:lineRule="auto" w:line="240"/>
-        <w:ind w:hanging="648" w:start="648" w:end="0"/>
-        <w:rPr/>
-      </w:pPr>
-      <w:r>
-        <w:rPr/>
-      </w:r>
-    </w:p>
-    <w:p>
-      <w:pPr>
-        <w:pStyle w:val="Normal0"/>
-        <w:widowControl w:val="false"/>
-        <w:spacing w:lineRule="auto" w:line="240"/>
         <w:ind w:hanging="540" w:start="540" w:end="0"/>
         <w:rPr/>
       </w:pPr>
@@ -548,7 +532,6 @@
         </w:pBdr>
         <w:spacing w:before="480" w:after="120"/>
         <w:rPr>
-          <w:rStyle w:val="None"/>
           <w:shd w:fill="00FF00" w:val="clear"/>
         </w:rPr>
       </w:pPr>
@@ -562,8 +545,8 @@
       <w:pPr>
         <w:pStyle w:val="Heading1"/>
         <w:spacing w:before="720" w:after="120"/>
-        <w:rPr>
-          <w:rStyle w:val="None"/>
+        <w:ind w:hanging="0" w:start="0" w:end="0"/>
+        <w:rPr>
           <w:b/>
           <w:bCs/>
         </w:rPr>
@@ -585,91 +568,18 @@
       </w:pPr>
       <w:r>
         <w:rPr>
-          <w:rStyle w:val="NoneA"/>
+          <w:rStyle w:val="None"/>
+          <w:lang w:val="de-DE"/>
         </w:rPr>
         <w:t>{{POLICY_TITLE}}</w:t>
-      </w:r>
-    </w:p>
-    <w:p>
-      <w:pPr>
-        <w:pStyle w:val="Normal0"/>
-        <w:rPr/>
-      </w:pPr>
-      <w:r>
-        <w:rPr>
-          <w:rStyle w:val="NoneA"/>
-        </w:rPr>
-        <w:t>Status</w:t>
-      </w:r>
-    </w:p>
-    <w:p>
-      <w:pPr>
-        <w:pStyle w:val="Textbox"/>
-        <w:rPr/>
-      </w:pPr>
-      <w:r>
-        <w:rPr>
-          <w:rStyle w:val="NoneA"/>
-        </w:rPr>
-        <w:t>{{PUBLICATION_STATUS}}</w:t>
-      </w:r>
-    </w:p>
-    <w:p>
-      <w:pPr>
-        <w:pStyle w:val="Normal0"/>
-        <w:rPr/>
-      </w:pPr>
-      <w:r>
-        <w:rPr>
-          <w:rStyle w:val="NoneA"/>
-        </w:rPr>
-        <w:t>Voraussichtliches Veröffentlichungsdatum</w:t>
-      </w:r>
-    </w:p>
-    <w:p>
-      <w:pPr>
-        <w:pStyle w:val="Textbox"/>
-        <w:rPr/>
-      </w:pPr>
-      <w:r>
-        <w:rPr>
-          <w:rStyle w:val="NoneA"/>
-        </w:rPr>
-        <w:t>{{PUBLICATION_DATE}}</w:t>
-      </w:r>
-    </w:p>
-    <w:p>
-      <w:pPr>
-        <w:pStyle w:val="Normal0"/>
-        <w:rPr>
-          <w:rStyle w:val="NoneA"/>
-        </w:rPr>
-      </w:pPr>
-      <w:r>
-        <w:rPr>
-          <w:rStyle w:val="NoneA"/>
-        </w:rPr>
-        <w:t>Link zum Referentenentwurf</w:t>
-      </w:r>
-    </w:p>
-    <w:p>
-      <w:pPr>
-        <w:pStyle w:val="Textbox"/>
-        <w:rPr/>
-      </w:pPr>
-      <w:r>
-        <w:rPr>
-          <w:rStyle w:val="NoneA"/>
-        </w:rPr>
-        <w:t>{{PUBLICATION_LINK}}</w:t>
       </w:r>
     </w:p>
     <w:p>
       <w:pPr>
         <w:pStyle w:val="Heading1"/>
         <w:spacing w:before="600" w:after="120"/>
-        <w:rPr>
-          <w:rStyle w:val="None"/>
+        <w:ind w:hanging="0" w:start="0" w:end="0"/>
+        <w:rPr>
           <w:b/>
           <w:bCs/>
         </w:rPr>
@@ -689,12 +599,11 @@
         <w:pStyle w:val="Normal0"/>
         <w:keepNext w:val="true"/>
         <w:rPr>
-          <w:rStyle w:val="None"/>
           <w:outline w:val="false"/>
           <w:color w:val="595959"/>
           <w:sz w:val="32"/>
           <w:szCs w:val="32"/>
-          <w:u w:val="none" w:color="595959"/>
+          <w:u w:val="none"/>
         </w:rPr>
       </w:pPr>
       <w:r>
@@ -702,7 +611,7 @@
           <w:rStyle w:val="None"/>
           <w:outline w:val="false"/>
           <w:color w:val="595959"/>
-          <w:u w:val="none" w:color="595959"/>
+          <w:u w:val="none"/>
           <w:lang w:val="de-DE"/>
         </w:rPr>
         <w:t>Ihr Regelungsvorhaben sollte sowohl den Bedürfnissen der Betroffenen als auch den Anforderungen der Umsetzung (z. B. in Behörden) gerecht werden.</w:t>
@@ -711,11 +620,13 @@
     <w:p>
       <w:pPr>
         <w:pStyle w:val="Heading2"/>
-        <w:rPr/>
-      </w:pPr>
-      <w:r>
-        <w:rPr>
-          <w:rStyle w:val="NoneA"/>
+        <w:ind w:hanging="0" w:start="0" w:end="0"/>
+        <w:rPr/>
+      </w:pPr>
+      <w:r>
+        <w:rPr>
+          <w:rStyle w:val="None"/>
+          <w:lang w:val="de-DE"/>
         </w:rPr>
         <w:t>Entspricht die Umsetzung des Regelungsvorhabens den Bedürfnissen der Betroffenen? Wie haben Sie das überprüft?</w:t>
       </w:r>
@@ -723,11 +634,18 @@
     <w:p>
       <w:pPr>
         <w:pStyle w:val="Textbox"/>
-        <w:rPr/>
-      </w:pPr>
-      <w:r>
-        <w:rPr>
-          <w:rStyle w:val="NoneA"/>
+        <w:pBdr>
+          <w:top w:val="single" w:sz="2" w:space="0" w:color="000000"/>
+          <w:left w:val="single" w:sz="2" w:space="0" w:color="000000"/>
+          <w:bottom w:val="single" w:sz="2" w:space="0" w:color="000000"/>
+          <w:right w:val="single" w:sz="2" w:space="0" w:color="000000"/>
+        </w:pBdr>
+        <w:rPr/>
+      </w:pPr>
+      <w:r>
+        <w:rPr>
+          <w:rStyle w:val="None"/>
+          <w:lang w:val="de-DE"/>
         </w:rPr>
         <w:t>{{PARTICIPATION_FORMATS}}</w:t>
       </w:r>
@@ -735,11 +653,13 @@
     <w:p>
       <w:pPr>
         <w:pStyle w:val="Heading2"/>
-        <w:rPr/>
-      </w:pPr>
-      <w:r>
-        <w:rPr>
-          <w:rStyle w:val="NoneA"/>
+        <w:ind w:hanging="0" w:start="0" w:end="0"/>
+        <w:rPr/>
+      </w:pPr>
+      <w:r>
+        <w:rPr>
+          <w:rStyle w:val="None"/>
+          <w:lang w:val="de-DE"/>
         </w:rPr>
         <w:t>Wie spiegeln sich die Erkenntnisse, die durch die oben genannten Schritte gewonnen wurde, im Regelungsvorhaben wider?</w:t>
       </w:r>
@@ -747,11 +667,18 @@
     <w:p>
       <w:pPr>
         <w:pStyle w:val="Textbox"/>
-        <w:rPr/>
-      </w:pPr>
-      <w:r>
-        <w:rPr>
-          <w:rStyle w:val="NoneA"/>
+        <w:pBdr>
+          <w:top w:val="single" w:sz="2" w:space="0" w:color="000000"/>
+          <w:left w:val="single" w:sz="2" w:space="0" w:color="000000"/>
+          <w:bottom w:val="single" w:sz="2" w:space="0" w:color="000000"/>
+          <w:right w:val="single" w:sz="2" w:space="0" w:color="000000"/>
+        </w:pBdr>
+        <w:rPr/>
+      </w:pPr>
+      <w:r>
+        <w:rPr>
+          <w:rStyle w:val="None"/>
+          <w:lang w:val="de-DE"/>
         </w:rPr>
         <w:t>{{PARTICIPATION_RESULTS}}</w:t>
       </w:r>
@@ -760,7 +687,6 @@
       <w:pPr>
         <w:pStyle w:val="Normal0"/>
         <w:rPr>
-          <w:rStyle w:val="None"/>
           <w:sz w:val="32"/>
           <w:szCs w:val="32"/>
         </w:rPr>
@@ -808,7 +734,7 @@
           <w:rStyle w:val="None"/>
           <w:outline w:val="false"/>
           <w:color w:val="595959"/>
-          <w:u w:val="none" w:color="595959"/>
+          <w:u w:val="none"/>
           <w:lang w:val="de-DE"/>
         </w:rPr>
         <w:t>{{PRINCIPLE_1_DESCRIPTION}}</w:t>
@@ -817,11 +743,13 @@
     <w:p>
       <w:pPr>
         <w:pStyle w:val="Heading2"/>
-        <w:rPr/>
-      </w:pPr>
-      <w:r>
-        <w:rPr>
-          <w:rStyle w:val="NoneA"/>
+        <w:ind w:hanging="0" w:start="0" w:end="0"/>
+        <w:rPr/>
+      </w:pPr>
+      <w:r>
+        <w:rPr>
+          <w:rStyle w:val="None"/>
+          <w:lang w:val="de-DE"/>
         </w:rPr>
         <w:t>Lässt sich das Vorhaben im Sinne des Prinzips umsetzen?</w:t>
       </w:r>
@@ -833,7 +761,8 @@
       </w:pPr>
       <w:r>
         <w:rPr>
-          <w:rStyle w:val="NoneA"/>
+          <w:rStyle w:val="None"/>
+          <w:lang w:val="de-DE"/>
         </w:rPr>
         <w:t>Löschen Sie raus, was nicht zutrifft:</w:t>
       </w:r>
@@ -846,7 +775,7 @@
       </w:pPr>
       <w:r>
         <w:rPr>
-          <w:rStyle w:val="NoneA"/>
+          <w:rStyle w:val="None"/>
           <w:lang w:val="de-DE"/>
         </w:rPr>
         <w:t>{{PRINCIPLE_1_ANSWER}}</w:t>
@@ -861,7 +790,7 @@
       </w:pPr>
       <w:r>
         <w:rPr>
-          <w:rStyle w:val="NoneA"/>
+          <w:rStyle w:val="None"/>
           <w:lang w:val="de-DE"/>
         </w:rPr>
         <w:t xml:space="preserve">Bei </w:t>
@@ -877,7 +806,7 @@
       </w:r>
       <w:r>
         <w:rPr>
-          <w:rStyle w:val="NoneA"/>
+          <w:rStyle w:val="None"/>
           <w:lang w:val="de-DE"/>
         </w:rPr>
         <w:t xml:space="preserve"> oder </w:t>
@@ -893,7 +822,7 @@
       </w:r>
       <w:r>
         <w:rPr>
-          <w:rStyle w:val="NoneA"/>
+          <w:rStyle w:val="None"/>
           <w:lang w:val="de-DE"/>
         </w:rPr>
         <w:t xml:space="preserve"> begründen Sie die Entscheidung und machen Sie bei Punkt 4 weiter.</w:t>
@@ -904,18 +833,14 @@
         <w:pStyle w:val="TextboxLabel"/>
         <w:ind w:hanging="0" w:start="720" w:end="0"/>
         <w:rPr>
-          <w:rStyle w:val="None"/>
           <w:outline w:val="false"/>
-          <w:color w:val="535353"/>
-          <w:u w:val="none" w:color="535353"/>
-        </w:rPr>
-      </w:pPr>
-      <w:r>
-        <w:rPr>
-          <w:rStyle w:val="None"/>
+          <w:color w:val="525252"/>
+        </w:rPr>
+      </w:pPr>
+      <w:r>
+        <w:rPr>
           <w:outline w:val="false"/>
-          <w:color w:val="535353"/>
-          <w:u w:val="none" w:color="535353"/>
+          <w:color w:val="525252"/>
           <w:lang w:val="de-DE"/>
         </w:rPr>
         <w:t>Verfügbare Schwerpunkte: {{PRINCIPLE_1_ASPECTS_AVAILABLE}}</w:t>
@@ -929,7 +854,7 @@
       </w:pPr>
       <w:r>
         <w:rPr>
-          <w:rStyle w:val="NoneA"/>
+          <w:rStyle w:val="None"/>
           <w:lang w:val="de-DE"/>
         </w:rPr>
         <w:t>Ausgewählte Schwerpunkte</w:t>
@@ -943,7 +868,7 @@
       </w:pPr>
       <w:r>
         <w:rPr>
-          <w:rStyle w:val="NoneA"/>
+          <w:rStyle w:val="None"/>
           <w:lang w:val="de-DE"/>
         </w:rPr>
         <w:t>{{PRINCIPLE_1_ASPECTS}}</w:t>
@@ -953,13 +878,11 @@
       <w:pPr>
         <w:pStyle w:val="TextboxLabel"/>
         <w:ind w:hanging="0" w:start="720" w:end="0"/>
-        <w:rPr>
-          <w:rStyle w:val="NoneA"/>
-        </w:rPr>
-      </w:pPr>
-      <w:r>
-        <w:rPr>
-          <w:rStyle w:val="NoneA"/>
+        <w:rPr/>
+      </w:pPr>
+      <w:r>
+        <w:rPr>
+          <w:rStyle w:val="None"/>
           <w:lang w:val="de-DE"/>
         </w:rPr>
         <w:t>Erläuterung</w:t>
@@ -968,12 +891,18 @@
     <w:p>
       <w:pPr>
         <w:pStyle w:val="Textbox"/>
+        <w:pBdr>
+          <w:top w:val="single" w:sz="2" w:space="0" w:color="000000"/>
+          <w:left w:val="single" w:sz="2" w:space="0" w:color="000000"/>
+          <w:bottom w:val="single" w:sz="2" w:space="0" w:color="000000"/>
+          <w:right w:val="single" w:sz="2" w:space="0" w:color="000000"/>
+        </w:pBdr>
         <w:ind w:hanging="0" w:start="708" w:end="0"/>
         <w:rPr/>
       </w:pPr>
       <w:r>
         <w:rPr>
-          <w:rStyle w:val="NoneA"/>
+          <w:rStyle w:val="None"/>
           <w:lang w:val="de-DE"/>
         </w:rPr>
         <w:t>{{PRINCIPLE_1_REASONING}}</w:t>
@@ -983,7 +912,6 @@
       <w:pPr>
         <w:pStyle w:val="Normal0"/>
         <w:rPr>
-          <w:rStyle w:val="None"/>
           <w:b/>
           <w:bCs/>
           <w:sz w:val="32"/>
@@ -1034,7 +962,8 @@
       </w:pPr>
       <w:r>
         <w:rPr>
-          <w:rStyle w:val="NoneA"/>
+          <w:rStyle w:val="None"/>
+          <w:lang w:val="de-DE"/>
         </w:rPr>
         <w:t>{{PRINCIPLE_2_DESCRIPTION}}</w:t>
       </w:r>
@@ -1042,11 +971,13 @@
     <w:p>
       <w:pPr>
         <w:pStyle w:val="Heading2"/>
-        <w:rPr/>
-      </w:pPr>
-      <w:r>
-        <w:rPr>
-          <w:rStyle w:val="NoneA"/>
+        <w:ind w:hanging="0" w:start="0" w:end="0"/>
+        <w:rPr/>
+      </w:pPr>
+      <w:r>
+        <w:rPr>
+          <w:rStyle w:val="None"/>
+          <w:lang w:val="de-DE"/>
         </w:rPr>
         <w:t>Lässt sich das Vorhaben im Sinne des Prinzips umsetzen?</w:t>
       </w:r>
@@ -1058,7 +989,8 @@
       </w:pPr>
       <w:r>
         <w:rPr>
-          <w:rStyle w:val="NoneA"/>
+          <w:rStyle w:val="None"/>
+          <w:lang w:val="de-DE"/>
         </w:rPr>
         <w:t>Löschen Sie raus, was nicht zutrifft:</w:t>
       </w:r>
@@ -1071,7 +1003,7 @@
       </w:pPr>
       <w:r>
         <w:rPr>
-          <w:rStyle w:val="NoneA"/>
+          <w:rStyle w:val="None"/>
           <w:lang w:val="de-DE"/>
         </w:rPr>
         <w:t>{{PRINCIPLE_2_ANSWER}}</w:t>
@@ -1086,7 +1018,7 @@
       </w:pPr>
       <w:r>
         <w:rPr>
-          <w:rStyle w:val="NoneA"/>
+          <w:rStyle w:val="None"/>
           <w:lang w:val="de-DE"/>
         </w:rPr>
         <w:t xml:space="preserve">Bei </w:t>
@@ -1102,7 +1034,7 @@
       </w:r>
       <w:r>
         <w:rPr>
-          <w:rStyle w:val="NoneA"/>
+          <w:rStyle w:val="None"/>
           <w:lang w:val="de-DE"/>
         </w:rPr>
         <w:t xml:space="preserve"> oder </w:t>
@@ -1118,7 +1050,7 @@
       </w:r>
       <w:r>
         <w:rPr>
-          <w:rStyle w:val="NoneA"/>
+          <w:rStyle w:val="None"/>
           <w:lang w:val="de-DE"/>
         </w:rPr>
         <w:t xml:space="preserve"> begründen Sie die Entscheidung und machen Sie bei Punkt 5 weiter.</w:t>
@@ -1129,18 +1061,14 @@
         <w:pStyle w:val="TextboxLabel"/>
         <w:ind w:hanging="0" w:start="720" w:end="0"/>
         <w:rPr>
-          <w:rStyle w:val="None"/>
           <w:outline w:val="false"/>
-          <w:color w:val="535353"/>
-          <w:u w:val="none" w:color="535353"/>
-        </w:rPr>
-      </w:pPr>
-      <w:r>
-        <w:rPr>
-          <w:rStyle w:val="None"/>
+          <w:color w:val="525252"/>
+        </w:rPr>
+      </w:pPr>
+      <w:r>
+        <w:rPr>
           <w:outline w:val="false"/>
-          <w:color w:val="535353"/>
-          <w:u w:val="none" w:color="535353"/>
+          <w:color w:val="525252"/>
           <w:lang w:val="de-DE"/>
         </w:rPr>
         <w:t>Verfügbare Schwerpunkte: {{PRINCIPLE_2_ASPECTS_AVAILABLE}}</w:t>
@@ -1154,7 +1082,7 @@
       </w:pPr>
       <w:r>
         <w:rPr>
-          <w:rStyle w:val="NoneA"/>
+          <w:rStyle w:val="None"/>
           <w:lang w:val="de-DE"/>
         </w:rPr>
         <w:t>Ausgewählte Schwerpunkte</w:t>
@@ -1168,7 +1096,7 @@
       </w:pPr>
       <w:r>
         <w:rPr>
-          <w:rStyle w:val="NoneA"/>
+          <w:rStyle w:val="None"/>
           <w:lang w:val="de-DE"/>
         </w:rPr>
         <w:t>{{PRINCIPLE_2_ASPECTS}}</w:t>
@@ -1182,7 +1110,7 @@
       </w:pPr>
       <w:r>
         <w:rPr>
-          <w:rStyle w:val="NoneA"/>
+          <w:rStyle w:val="None"/>
           <w:lang w:val="de-DE"/>
         </w:rPr>
         <w:t>Erläuterung</w:t>
@@ -1196,7 +1124,7 @@
       </w:pPr>
       <w:r>
         <w:rPr>
-          <w:rStyle w:val="NoneA"/>
+          <w:rStyle w:val="None"/>
           <w:lang w:val="de-DE"/>
         </w:rPr>
         <w:t>{{PRINCIPLE_2_REASONING}}</w:t>
@@ -1206,7 +1134,6 @@
       <w:pPr>
         <w:pStyle w:val="Normal0"/>
         <w:rPr>
-          <w:rStyle w:val="None"/>
           <w:b/>
           <w:bCs/>
           <w:sz w:val="32"/>
@@ -1256,7 +1183,8 @@
       </w:pPr>
       <w:r>
         <w:rPr>
-          <w:rStyle w:val="NoneA"/>
+          <w:rStyle w:val="None"/>
+          <w:lang w:val="de-DE"/>
         </w:rPr>
         <w:t>{{PRINCIPLE_3_DESCRIPTION}}</w:t>
       </w:r>
@@ -1264,11 +1192,13 @@
     <w:p>
       <w:pPr>
         <w:pStyle w:val="Heading2"/>
-        <w:rPr/>
-      </w:pPr>
-      <w:r>
-        <w:rPr>
-          <w:rStyle w:val="NoneA"/>
+        <w:ind w:hanging="0" w:start="0" w:end="0"/>
+        <w:rPr/>
+      </w:pPr>
+      <w:r>
+        <w:rPr>
+          <w:rStyle w:val="None"/>
+          <w:lang w:val="de-DE"/>
         </w:rPr>
         <w:t>Lässt sich das Vorhaben im Sinne des Prinzips umsetzen?</w:t>
       </w:r>
@@ -1280,7 +1210,8 @@
       </w:pPr>
       <w:r>
         <w:rPr>
-          <w:rStyle w:val="NoneA"/>
+          <w:rStyle w:val="None"/>
+          <w:lang w:val="de-DE"/>
         </w:rPr>
         <w:t>Löschen Sie raus, was nicht zutrifft:</w:t>
       </w:r>
@@ -1293,7 +1224,7 @@
       </w:pPr>
       <w:r>
         <w:rPr>
-          <w:rStyle w:val="NoneA"/>
+          <w:rStyle w:val="None"/>
           <w:lang w:val="de-DE"/>
         </w:rPr>
         <w:t>{{PRINCIPLE_3_ANSWER}}</w:t>
@@ -1308,7 +1239,7 @@
       </w:pPr>
       <w:r>
         <w:rPr>
-          <w:rStyle w:val="NoneA"/>
+          <w:rStyle w:val="None"/>
           <w:lang w:val="de-DE"/>
         </w:rPr>
         <w:t xml:space="preserve">Bei </w:t>
@@ -1324,7 +1255,7 @@
       </w:r>
       <w:r>
         <w:rPr>
-          <w:rStyle w:val="NoneA"/>
+          <w:rStyle w:val="None"/>
           <w:lang w:val="de-DE"/>
         </w:rPr>
         <w:t xml:space="preserve"> oder </w:t>
@@ -1340,7 +1271,7 @@
       </w:r>
       <w:r>
         <w:rPr>
-          <w:rStyle w:val="NoneA"/>
+          <w:rStyle w:val="None"/>
           <w:lang w:val="de-DE"/>
         </w:rPr>
         <w:t xml:space="preserve"> begründen Sie die Entscheidung und machen Sie bei Punkt 6 weiter.</w:t>
@@ -1351,18 +1282,14 @@
         <w:pStyle w:val="TextboxLabel"/>
         <w:ind w:hanging="0" w:start="720" w:end="0"/>
         <w:rPr>
-          <w:rStyle w:val="None"/>
           <w:outline w:val="false"/>
-          <w:color w:val="535353"/>
-          <w:u w:val="none" w:color="535353"/>
-        </w:rPr>
-      </w:pPr>
-      <w:r>
-        <w:rPr>
-          <w:rStyle w:val="None"/>
+          <w:color w:val="525252"/>
+        </w:rPr>
+      </w:pPr>
+      <w:r>
+        <w:rPr>
           <w:outline w:val="false"/>
-          <w:color w:val="535353"/>
-          <w:u w:val="none" w:color="535353"/>
+          <w:color w:val="525252"/>
           <w:lang w:val="de-DE"/>
         </w:rPr>
         <w:t>Verfügbare Schwerpunkte: {{PRINCIPLE_3_ASPECTS_AVAILABLE}}</w:t>
@@ -1376,7 +1303,7 @@
       </w:pPr>
       <w:r>
         <w:rPr>
-          <w:rStyle w:val="NoneA"/>
+          <w:rStyle w:val="None"/>
           <w:lang w:val="de-DE"/>
         </w:rPr>
         <w:t>Ausgewählte Schwerpunkte</w:t>
@@ -1390,7 +1317,7 @@
       </w:pPr>
       <w:r>
         <w:rPr>
-          <w:rStyle w:val="NoneA"/>
+          <w:rStyle w:val="None"/>
           <w:lang w:val="de-DE"/>
         </w:rPr>
         <w:t>{{PRINCIPLE_3_ASPECTS}}</w:t>
@@ -1404,7 +1331,7 @@
       </w:pPr>
       <w:r>
         <w:rPr>
-          <w:rStyle w:val="NoneA"/>
+          <w:rStyle w:val="None"/>
           <w:lang w:val="de-DE"/>
         </w:rPr>
         <w:t>Erläuterung</w:t>
@@ -1418,7 +1345,7 @@
       </w:pPr>
       <w:r>
         <w:rPr>
-          <w:rStyle w:val="NoneA"/>
+          <w:rStyle w:val="None"/>
           <w:lang w:val="de-DE"/>
         </w:rPr>
         <w:t>{{PRINCIPLE_3_REASONING}}</w:t>
@@ -1428,7 +1355,7 @@
       <w:pPr>
         <w:pStyle w:val="Normal0"/>
         <w:rPr>
-          <w:rStyle w:val="NoneA"/>
+          <w:rStyle w:val="None"/>
         </w:rPr>
       </w:pPr>
       <w:r>
@@ -1439,7 +1366,6 @@
       <w:pPr>
         <w:pStyle w:val="Normal0"/>
         <w:rPr>
-          <w:rStyle w:val="None"/>
           <w:b/>
           <w:bCs/>
           <w:sz w:val="32"/>
@@ -1478,7 +1404,8 @@
       </w:pPr>
       <w:r>
         <w:rPr>
-          <w:rStyle w:val="NoneA"/>
+          <w:rStyle w:val="None"/>
+          <w:lang w:val="de-DE"/>
         </w:rPr>
         <w:t>{{PRINCIPLE_4_DESCRIPTION}}</w:t>
       </w:r>
@@ -1486,11 +1413,13 @@
     <w:p>
       <w:pPr>
         <w:pStyle w:val="Heading2"/>
-        <w:rPr/>
-      </w:pPr>
-      <w:r>
-        <w:rPr>
-          <w:rStyle w:val="NoneA"/>
+        <w:ind w:hanging="0" w:start="0" w:end="0"/>
+        <w:rPr/>
+      </w:pPr>
+      <w:r>
+        <w:rPr>
+          <w:rStyle w:val="None"/>
+          <w:lang w:val="de-DE"/>
         </w:rPr>
         <w:t>Lässt sich das Vorhaben im Sinne des Prinzips umsetzen?</w:t>
       </w:r>
@@ -1502,7 +1431,8 @@
       </w:pPr>
       <w:r>
         <w:rPr>
-          <w:rStyle w:val="NoneA"/>
+          <w:rStyle w:val="None"/>
+          <w:lang w:val="de-DE"/>
         </w:rPr>
         <w:t>Löschen Sie raus, was nicht zutrifft:</w:t>
       </w:r>
@@ -1515,7 +1445,7 @@
       </w:pPr>
       <w:r>
         <w:rPr>
-          <w:rStyle w:val="NoneA"/>
+          <w:rStyle w:val="None"/>
           <w:lang w:val="de-DE"/>
         </w:rPr>
         <w:t>{{PRINCIPLE_4_ANSWER}}</w:t>
@@ -1530,7 +1460,7 @@
       </w:pPr>
       <w:r>
         <w:rPr>
-          <w:rStyle w:val="NoneA"/>
+          <w:rStyle w:val="None"/>
           <w:lang w:val="de-DE"/>
         </w:rPr>
         <w:t xml:space="preserve">Bei </w:t>
@@ -1546,7 +1476,7 @@
       </w:r>
       <w:r>
         <w:rPr>
-          <w:rStyle w:val="NoneA"/>
+          <w:rStyle w:val="None"/>
           <w:lang w:val="de-DE"/>
         </w:rPr>
         <w:t xml:space="preserve"> oder </w:t>
@@ -1562,7 +1492,7 @@
       </w:r>
       <w:r>
         <w:rPr>
-          <w:rStyle w:val="NoneA"/>
+          <w:rStyle w:val="None"/>
           <w:lang w:val="de-DE"/>
         </w:rPr>
         <w:t xml:space="preserve"> begründen Sie die Entscheidung und machen Sie bei Punkt 7 weiter.</w:t>
@@ -1573,18 +1503,14 @@
         <w:pStyle w:val="TextboxLabel"/>
         <w:ind w:hanging="0" w:start="720" w:end="0"/>
         <w:rPr>
-          <w:rStyle w:val="None"/>
           <w:outline w:val="false"/>
-          <w:color w:val="535353"/>
-          <w:u w:val="none" w:color="535353"/>
-        </w:rPr>
-      </w:pPr>
-      <w:r>
-        <w:rPr>
-          <w:rStyle w:val="None"/>
+          <w:color w:val="525252"/>
+        </w:rPr>
+      </w:pPr>
+      <w:r>
+        <w:rPr>
           <w:outline w:val="false"/>
-          <w:color w:val="535353"/>
-          <w:u w:val="none" w:color="535353"/>
+          <w:color w:val="525252"/>
           <w:lang w:val="de-DE"/>
         </w:rPr>
         <w:t>Verfügbare Schwerpunkte: {{PRINCIPLE_4_ASPECTS_AVAILABLE}}</w:t>
@@ -1598,7 +1524,7 @@
       </w:pPr>
       <w:r>
         <w:rPr>
-          <w:rStyle w:val="NoneA"/>
+          <w:rStyle w:val="None"/>
           <w:lang w:val="de-DE"/>
         </w:rPr>
         <w:t>Ausgewählte Schwerpunkte</w:t>
@@ -1612,7 +1538,7 @@
       </w:pPr>
       <w:r>
         <w:rPr>
-          <w:rStyle w:val="NoneA"/>
+          <w:rStyle w:val="None"/>
           <w:lang w:val="de-DE"/>
         </w:rPr>
         <w:t>{{PRINCIPLE_4_ASPECTS}}</w:t>
@@ -1626,7 +1552,7 @@
       </w:pPr>
       <w:r>
         <w:rPr>
-          <w:rStyle w:val="NoneA"/>
+          <w:rStyle w:val="None"/>
           <w:lang w:val="de-DE"/>
         </w:rPr>
         <w:t>Erläuterung</w:t>
@@ -1640,7 +1566,7 @@
       </w:pPr>
       <w:r>
         <w:rPr>
-          <w:rStyle w:val="NoneA"/>
+          <w:rStyle w:val="None"/>
           <w:lang w:val="de-DE"/>
         </w:rPr>
         <w:t>{{PRINCIPLE_4_REASONING}}</w:t>
@@ -1650,7 +1576,6 @@
       <w:pPr>
         <w:pStyle w:val="Normal0"/>
         <w:rPr>
-          <w:rStyle w:val="None"/>
           <w:b/>
           <w:bCs/>
           <w:sz w:val="32"/>
@@ -1699,7 +1624,8 @@
       </w:pPr>
       <w:r>
         <w:rPr>
-          <w:rStyle w:val="NoneA"/>
+          <w:rStyle w:val="None"/>
+          <w:lang w:val="de-DE"/>
         </w:rPr>
         <w:t>{{PRINCIPLE_5_DESCRIPTION}}</w:t>
       </w:r>
@@ -1707,11 +1633,13 @@
     <w:p>
       <w:pPr>
         <w:pStyle w:val="Heading2"/>
-        <w:rPr/>
-      </w:pPr>
-      <w:r>
-        <w:rPr>
-          <w:rStyle w:val="NoneA"/>
+        <w:ind w:hanging="0" w:start="0" w:end="0"/>
+        <w:rPr/>
+      </w:pPr>
+      <w:r>
+        <w:rPr>
+          <w:rStyle w:val="None"/>
+          <w:lang w:val="de-DE"/>
         </w:rPr>
         <w:t>Lässt sich das Vorhaben im Sinne des Prinzips umsetzen?</w:t>
       </w:r>
@@ -1723,7 +1651,8 @@
       </w:pPr>
       <w:r>
         <w:rPr>
-          <w:rStyle w:val="NoneA"/>
+          <w:rStyle w:val="None"/>
+          <w:lang w:val="de-DE"/>
         </w:rPr>
         <w:t>Löschen Sie raus, was nicht zutrifft:</w:t>
       </w:r>
@@ -1736,7 +1665,7 @@
       </w:pPr>
       <w:r>
         <w:rPr>
-          <w:rStyle w:val="NoneA"/>
+          <w:rStyle w:val="None"/>
           <w:lang w:val="de-DE"/>
         </w:rPr>
         <w:t>{{PRINCIPLE_5_ANSWER}}</w:t>
@@ -1751,7 +1680,7 @@
       </w:pPr>
       <w:r>
         <w:rPr>
-          <w:rStyle w:val="NoneA"/>
+          <w:rStyle w:val="None"/>
           <w:lang w:val="de-DE"/>
         </w:rPr>
         <w:t xml:space="preserve">Bei </w:t>
@@ -1767,7 +1696,7 @@
       </w:r>
       <w:r>
         <w:rPr>
-          <w:rStyle w:val="NoneA"/>
+          <w:rStyle w:val="None"/>
           <w:lang w:val="de-DE"/>
         </w:rPr>
         <w:t xml:space="preserve"> oder </w:t>
@@ -1783,7 +1712,7 @@
       </w:r>
       <w:r>
         <w:rPr>
-          <w:rStyle w:val="NoneA"/>
+          <w:rStyle w:val="None"/>
           <w:lang w:val="de-DE"/>
         </w:rPr>
         <w:t xml:space="preserve"> begründen Sie die Entscheidung.</w:t>
@@ -1794,18 +1723,14 @@
         <w:pStyle w:val="TextboxLabel"/>
         <w:ind w:hanging="0" w:start="720" w:end="0"/>
         <w:rPr>
-          <w:rStyle w:val="None"/>
           <w:outline w:val="false"/>
-          <w:color w:val="535353"/>
-          <w:u w:val="none" w:color="535353"/>
-        </w:rPr>
-      </w:pPr>
-      <w:r>
-        <w:rPr>
-          <w:rStyle w:val="None"/>
+          <w:color w:val="525252"/>
+        </w:rPr>
+      </w:pPr>
+      <w:r>
+        <w:rPr>
           <w:outline w:val="false"/>
-          <w:color w:val="535353"/>
-          <w:u w:val="none" w:color="535353"/>
+          <w:color w:val="525252"/>
           <w:lang w:val="de-DE"/>
         </w:rPr>
         <w:t>Verfügbare Schwerpunkte: {{PRINCIPLE_5_ASPECTS_AVAILABLE}}</w:t>
@@ -1819,7 +1744,7 @@
       </w:pPr>
       <w:r>
         <w:rPr>
-          <w:rStyle w:val="NoneA"/>
+          <w:rStyle w:val="None"/>
           <w:lang w:val="de-DE"/>
         </w:rPr>
         <w:t>Ausgewählte Schwerpunkte</w:t>
@@ -1833,7 +1758,7 @@
       </w:pPr>
       <w:r>
         <w:rPr>
-          <w:rStyle w:val="NoneA"/>
+          <w:rStyle w:val="None"/>
           <w:lang w:val="de-DE"/>
         </w:rPr>
         <w:t>{{PRINCIPLE_5_ASPECTS}}</w:t>
@@ -1847,7 +1772,7 @@
       </w:pPr>
       <w:r>
         <w:rPr>
-          <w:rStyle w:val="NoneA"/>
+          <w:rStyle w:val="None"/>
           <w:lang w:val="de-DE"/>
         </w:rPr>
         <w:t>Erläuterung</w:t>
@@ -1861,7 +1786,7 @@
       </w:pPr>
       <w:r>
         <w:rPr>
-          <w:rStyle w:val="NoneA"/>
+          <w:rStyle w:val="None"/>
           <w:lang w:val="de-DE"/>
         </w:rPr>
         <w:t>{{PRINCIPLE_5_REASONING}}</w:t>
@@ -1883,8 +1808,8 @@
       <w:pPr>
         <w:pStyle w:val="Heading1"/>
         <w:spacing w:before="720" w:after="120"/>
-        <w:rPr>
-          <w:rStyle w:val="None"/>
+        <w:ind w:hanging="0" w:start="0" w:end="0"/>
+        <w:rPr>
           <w:b/>
           <w:bCs/>
         </w:rPr>
@@ -1925,7 +1850,7 @@
       </w:r>
       <w:r>
         <w:rPr>
-          <w:rStyle w:val="NoneA"/>
+          <w:rStyle w:val="None"/>
           <w:lang w:val="de-DE"/>
         </w:rPr>
         <w:t xml:space="preserve"> Sie die Dokumentation als </w:t>
@@ -1966,7 +1891,7 @@
       </w:r>
       <w:r>
         <w:rPr>
-          <w:rStyle w:val="NoneA"/>
+          <w:rStyle w:val="None"/>
           <w:lang w:val="de-DE"/>
         </w:rPr>
         <w:t xml:space="preserve"> Sie die von Ihnen erstellte Dokumentation als PDF per E-Mail an folgende Adresse: </w:t>
@@ -1985,7 +1910,7 @@
       </w:hyperlink>
       <w:r>
         <w:rPr>
-          <w:rStyle w:val="NoneA"/>
+          <w:rStyle w:val="None"/>
           <w:lang w:val="de-DE"/>
         </w:rPr>
         <w:t>. Der NKR (Nationaler Normenkontrollrat) prüft Ihr Vorhaben hinsichtlich der Berücksichtigung der Prinzipien digitaltauglicher Gesetzgebung. Bei Fragen wird der NKR auf Sie zukommen.</w:t>
@@ -2017,7 +1942,7 @@
       </w:r>
       <w:r>
         <w:rPr>
-          <w:rStyle w:val="NoneA"/>
+          <w:rStyle w:val="None"/>
           <w:lang w:val="de-DE"/>
         </w:rPr>
         <w:t xml:space="preserve"> senden Sie eine Kopie der E-Mail mit der PDF-Datei an </w:t>
@@ -2036,7 +1961,7 @@
       </w:hyperlink>
       <w:r>
         <w:rPr>
-          <w:rStyle w:val="NoneA"/>
+          <w:rStyle w:val="None"/>
           <w:lang w:val="de-DE"/>
         </w:rPr>
         <w:t>.</w:t>
@@ -2068,7 +1993,7 @@
       </w:r>
       <w:r>
         <w:rPr>
-          <w:rStyle w:val="NoneA"/>
+          <w:rStyle w:val="None"/>
           <w:lang w:val="de-DE"/>
         </w:rPr>
         <w:t xml:space="preserve"> und Skizzen sind vom NKR gern gesehen. Hängen Sie diese formlos als PDF oder als Screenshot an.</w:t>
@@ -2091,7 +2016,7 @@
       </w:pPr>
       <w:r>
         <w:rPr>
-          <w:rStyle w:val="NoneA"/>
+          <w:rStyle w:val="None"/>
           <w:lang w:val="de-DE"/>
         </w:rPr>
         <w:t>Damit ist der Digitalcheck für Sie beendet.</w:t>
@@ -2100,11 +2025,13 @@
     <w:p>
       <w:pPr>
         <w:pStyle w:val="Heading2"/>
-        <w:rPr/>
-      </w:pPr>
-      <w:r>
-        <w:rPr>
-          <w:rStyle w:val="NoneA"/>
+        <w:ind w:hanging="0" w:start="0" w:end="0"/>
+        <w:rPr/>
+      </w:pPr>
+      <w:r>
+        <w:rPr>
+          <w:rStyle w:val="None"/>
+          <w:lang w:val="de-DE"/>
         </w:rPr>
         <w:t>Gut zu wissen: Das prüft der Nationale Normenkontrollrat</w:t>
       </w:r>
@@ -2116,19 +2043,22 @@
       </w:pPr>
       <w:r>
         <w:rPr>
-          <w:rStyle w:val="NoneA"/>
-        </w:rPr>
-        <w:t>Der NKR prüft das Regelungsvorhaben auf Möglichkeiten der digitalen Umsetzung. Die Basis ist der von Ihnen durchgeführte Digitalcheck. Das wesentliche Prüfkriterium ist die methodische und inhaltliche Nachvollziehbarkeit. Sein Prüfergebnis veröffentlicht er gegebenenfalls in seinen Stellungnahmen. Wenn Sie eine Visualisierung angefertigt haben und Sie der Veröffentlichung zustimmen, kann diese an die Stellungnahme angehängt werden. Bei Fragen oder Anregungen kommt Ihre Ansprechperson im NKR-Sekretariat auf Sie zu.</w:t>
+          <w:rStyle w:val="None"/>
+          <w:lang w:val="de-DE"/>
+        </w:rPr>
+        <w:t>Der NKR prüft das Regelung---svorhaben auf Möglichkeiten der digitalen Umsetzung. Die Basis ist der von Ihnen durchgeführte Digitalcheck. Das wesentliche Prüfkriterium ist die methodische und inhaltliche Nachvollziehbarkeit. Sein Prüfergebnis veröffentlicht er gegebenenfalls in seinen Stellungnahmen. Wenn Sie eine Visualisierung angefertigt haben und Sie der Veröffentlichung zustimmen, kann diese an die Stellungnahme angehängt werden. Bei Fragen oder Anregungen kommt Ihre Ansprechperson im NKR-Sekretariat auf Sie zu.</w:t>
       </w:r>
     </w:p>
     <w:p>
       <w:pPr>
         <w:pStyle w:val="Heading2"/>
-        <w:rPr/>
-      </w:pPr>
-      <w:r>
-        <w:rPr>
-          <w:rStyle w:val="NoneA"/>
+        <w:ind w:hanging="0" w:start="0" w:end="0"/>
+        <w:rPr/>
+      </w:pPr>
+      <w:r>
+        <w:rPr>
+          <w:rStyle w:val="None"/>
+          <w:lang w:val="de-DE"/>
         </w:rPr>
         <w:t xml:space="preserve">Sie haben Fragen oder benötigen Unterstützung? </w:t>
       </w:r>
@@ -2136,22 +2066,12 @@
     <w:p>
       <w:pPr>
         <w:pStyle w:val="Normal0"/>
-        <w:keepNext w:val="false"/>
-        <w:keepLines w:val="false"/>
-        <w:pageBreakBefore w:val="false"/>
-        <w:widowControl/>
-        <w:suppressLineNumbers w:val="0"/>
-        <w:shd w:val="clear" w:color="auto" w:fill="auto"/>
-        <w:suppressAutoHyphens w:val="false"/>
-        <w:bidi w:val="0"/>
-        <w:spacing w:lineRule="auto" w:line="300" w:beforeAutospacing="0" w:before="180" w:afterAutospacing="0" w:after="120"/>
-        <w:ind w:hanging="0" w:start="0" w:end="0"/>
-        <w:jc w:val="start"/>
-        <w:rPr/>
-      </w:pPr>
-      <w:r>
-        <w:rPr>
-          <w:rStyle w:val="NoneA"/>
+        <w:rPr/>
+      </w:pPr>
+      <w:r>
+        <w:rPr>
+          <w:rStyle w:val="None"/>
+          <w:lang w:val="de-DE"/>
         </w:rPr>
         <w:t xml:space="preserve">Rufen Sie uns an: {{DS_PHONE}} oder schreiben Sie uns unter: </w:t>
       </w:r>
@@ -2168,7 +2088,8 @@
       </w:hyperlink>
       <w:r>
         <w:rPr>
-          <w:rStyle w:val="NoneA"/>
+          <w:rStyle w:val="None"/>
+          <w:lang w:val="de-DE"/>
         </w:rPr>
         <w:t>.</w:t>
       </w:r>
@@ -2176,19 +2097,22 @@
     <w:p>
       <w:pPr>
         <w:pStyle w:val="Normal0"/>
+        <w:keepNext w:val="false"/>
+        <w:keepLines w:val="false"/>
+        <w:pageBreakBefore w:val="false"/>
         <w:widowControl/>
-        <w:suppressLineNumbers w:val="0"/>
-        <w:shd w:val="clear" w:color="auto" w:fill="auto"/>
         <w:suppressAutoHyphens w:val="false"/>
+        <w:overflowPunct w:val="false"/>
         <w:bidi w:val="0"/>
-        <w:spacing w:lineRule="auto" w:line="300" w:beforeAutospacing="0" w:before="180" w:afterAutospacing="0" w:after="120"/>
+        <w:spacing w:lineRule="auto" w:line="300" w:before="180" w:after="120"/>
         <w:ind w:hanging="0" w:start="0" w:end="0"/>
         <w:jc w:val="start"/>
         <w:rPr/>
       </w:pPr>
       <w:r>
         <w:rPr>
-          <w:rStyle w:val="NoneA"/>
+          <w:rStyle w:val="None"/>
+          <w:lang w:val="de-DE"/>
         </w:rPr>
         <w:t>{{APPENDICES}}</w:t>
       </w:r>
@@ -2206,7 +2130,7 @@
       <w:pgNumType w:fmt="decimal"/>
       <w:formProt w:val="false"/>
       <w:textDirection w:val="lrTb"/>
-      <w:docGrid w:type="default" w:linePitch="100" w:charSpace="0"/>
+      <w:docGrid w:type="default" w:linePitch="100" w:charSpace="8192"/>
     </w:sectPr>
   </w:body>
 </w:document>
@@ -2283,7 +2207,7 @@
       <w:spacing w:lineRule="auto" w:line="360" w:before="120" w:after="120"/>
       <w:jc w:val="end"/>
       <w:rPr>
-        <w:rStyle w:val="NoneA"/>
+        <w:lang w:val="de-DE"/>
       </w:rPr>
     </w:pPr>
     <w:r>
@@ -2291,20 +2215,13 @@
         <w:shd w:fill="auto" w:val="clear"/>
         <w:lang w:val="de-DE"/>
       </w:rPr>
-      <w:t>Version Mai 2026</w:t>
-    </w:r>
-    <w:r>
-      <w:rPr>
-        <w:rStyle w:val="NoneA"/>
-        <w:lang w:val="de-DE"/>
-      </w:rPr>
-      <w:t xml:space="preserve"> </w:t>
+      <w:t>Version Februar 2026</w:t>
     </w:r>
     <w:r>
       <w:rPr>
         <w:lang w:val="de-DE"/>
       </w:rPr>
-      <w:t>Datum: {{TIMESTAMP}}</w:t>
+      <w:t xml:space="preserve"> Datum: 2.3.2026</w:t>
     </w:r>
   </w:p>
   <w:p>
@@ -2317,7 +2234,10 @@
       </w:tabs>
       <w:spacing w:lineRule="auto" w:line="360" w:before="120" w:after="120"/>
       <w:jc w:val="end"/>
-      <w:rPr/>
+      <w:rPr>
+        <w:shd w:fill="auto" w:val="clear"/>
+        <w:lang w:val="de-DE"/>
+      </w:rPr>
     </w:pPr>
     <w:r>
       <w:rPr/>
@@ -2377,7 +2297,7 @@
       <w:spacing w:lineRule="auto" w:line="360" w:before="120" w:after="120"/>
       <w:jc w:val="end"/>
       <w:rPr>
-        <w:rStyle w:val="NoneA"/>
+        <w:lang w:val="de-DE"/>
       </w:rPr>
     </w:pPr>
     <w:r>
@@ -2385,20 +2305,13 @@
         <w:shd w:fill="auto" w:val="clear"/>
         <w:lang w:val="de-DE"/>
       </w:rPr>
-      <w:t>Version Mai 2026</w:t>
-    </w:r>
-    <w:r>
-      <w:rPr>
-        <w:rStyle w:val="NoneA"/>
-        <w:lang w:val="de-DE"/>
-      </w:rPr>
-      <w:t xml:space="preserve"> </w:t>
+      <w:t>Version Februar 2026</w:t>
     </w:r>
     <w:r>
       <w:rPr>
         <w:lang w:val="de-DE"/>
       </w:rPr>
-      <w:t>Datum: {{TIMESTAMP}}</w:t>
+      <w:t xml:space="preserve"> Datum: 2.3.2026</w:t>
     </w:r>
   </w:p>
   <w:p>
@@ -2411,7 +2324,10 @@
       </w:tabs>
       <w:spacing w:lineRule="auto" w:line="360" w:before="120" w:after="120"/>
       <w:jc w:val="end"/>
-      <w:rPr/>
+      <w:rPr>
+        <w:shd w:fill="auto" w:val="clear"/>
+        <w:lang w:val="de-DE"/>
+      </w:rPr>
     </w:pPr>
     <w:r>
       <w:rPr/>
@@ -2715,7 +2631,7 @@
         <w:tabs>
           <w:tab w:val="num" w:pos="0"/>
         </w:tabs>
-        <w:ind w:start="590" w:hanging="590"/>
+        <w:ind w:start="114" w:hanging="114"/>
       </w:pPr>
       <w:rPr>
         <w:rFonts w:ascii="Times New Roman" w:hAnsi="Times New Roman" w:cs="Times New Roman" w:hint="default"/>
@@ -3434,7 +3350,7 @@
       </w:pPr>
     </w:pPrDefault>
   </w:docDefaults>
-  <w:style w:type="paragraph" w:styleId="Normal" w:default="1">
+  <w:style w:type="paragraph" w:styleId="Normal">
     <w:name w:val="Normal"/>
     <w:qFormat/>
     <w:pPr>
@@ -3442,15 +3358,15 @@
       <w:keepLines w:val="false"/>
       <w:pageBreakBefore w:val="false"/>
       <w:widowControl/>
-      <w:shd w:val="clear" w:color="auto" w:fill="auto"/>
       <w:suppressAutoHyphens w:val="false"/>
+      <w:overflowPunct w:val="false"/>
       <w:bidi w:val="0"/>
-      <w:spacing w:lineRule="auto" w:line="240" w:beforeAutospacing="0" w:before="0" w:afterAutospacing="0" w:after="0"/>
+      <w:spacing w:lineRule="auto" w:line="240" w:before="0" w:after="0"/>
       <w:ind w:hanging="0" w:start="0" w:end="0"/>
       <w:jc w:val="start"/>
     </w:pPr>
     <w:rPr>
-      <w:rFonts w:ascii="Times New Roman" w:hAnsi="Times New Roman" w:eastAsia="Arial Unicode MS" w:cs="Times New Roman"/>
+      <w:rFonts w:ascii="Arial" w:hAnsi="Arial" w:eastAsia="Arial Unicode MS" w:cs="Times New Roman"/>
       <w:b w:val="false"/>
       <w:bCs w:val="false"/>
       <w:i w:val="false"/>
@@ -3468,11 +3384,11 @@
       <w:w w:val="100"/>
       <w:kern w:val="0"/>
       <w:position w:val="0"/>
-      <w:sz w:val="24"/>
+      <w:sz w:val="20"/>
       <w:szCs w:val="24"/>
-      <w:u w:val="none" w:color="FFFFFF"/>
+      <w:u w:val="none"/>
       <w:vertAlign w:val="baseline"/>
-      <w:lang w:val="en-US" w:eastAsia="en-US" w:bidi="ar-SA"/>
+      <w:lang w:val="de-DE" w:eastAsia="en-US" w:bidi="ar-SA"/>
     </w:rPr>
   </w:style>
   <w:style w:type="paragraph" w:styleId="Heading1">
@@ -3483,10 +3399,14 @@
       <w:keepLines w:val="false"/>
       <w:pageBreakBefore w:val="false"/>
       <w:widowControl/>
-      <w:shd w:val="clear" w:color="auto" w:fill="auto"/>
+      <w:numPr>
+        <w:ilvl w:val="0"/>
+        <w:numId w:val="0"/>
+      </w:numPr>
       <w:suppressAutoHyphens w:val="false"/>
+      <w:overflowPunct w:val="false"/>
       <w:bidi w:val="0"/>
-      <w:spacing w:lineRule="auto" w:line="300" w:beforeAutospacing="0" w:before="840" w:afterAutospacing="0" w:after="120"/>
+      <w:spacing w:lineRule="auto" w:line="300" w:before="840" w:after="120"/>
       <w:ind w:hanging="0" w:start="0" w:end="0"/>
       <w:jc w:val="start"/>
       <w:outlineLvl w:val="0"/>
@@ -3512,7 +3432,7 @@
       <w:position w:val="0"/>
       <w:sz w:val="32"/>
       <w:szCs w:val="32"/>
-      <w:u w:val="none" w:color="000000"/>
+      <w:u w:val="none"/>
       <w:shd w:fill="auto" w:val="clear"/>
       <w:vertAlign w:val="baseline"/>
       <w:lang w:val="de-DE" w:eastAsia="zh-CN" w:bidi="hi-IN"/>
@@ -3526,10 +3446,14 @@
       <w:keepLines w:val="false"/>
       <w:pageBreakBefore w:val="false"/>
       <w:widowControl/>
-      <w:shd w:val="clear" w:color="auto" w:fill="auto"/>
+      <w:numPr>
+        <w:ilvl w:val="0"/>
+        <w:numId w:val="0"/>
+      </w:numPr>
       <w:suppressAutoHyphens w:val="false"/>
+      <w:overflowPunct w:val="false"/>
       <w:bidi w:val="0"/>
-      <w:spacing w:lineRule="auto" w:line="300" w:beforeAutospacing="0" w:before="360" w:afterAutospacing="0" w:after="120"/>
+      <w:spacing w:lineRule="auto" w:line="300" w:before="360" w:after="120"/>
       <w:ind w:hanging="0" w:start="0" w:end="0"/>
       <w:jc w:val="start"/>
       <w:outlineLvl w:val="1"/>
@@ -3555,13 +3479,13 @@
       <w:position w:val="0"/>
       <w:sz w:val="24"/>
       <w:szCs w:val="24"/>
-      <w:u w:val="none" w:color="000000"/>
+      <w:u w:val="none"/>
       <w:shd w:fill="auto" w:val="clear"/>
       <w:vertAlign w:val="baseline"/>
       <w:lang w:val="de-DE" w:eastAsia="zh-CN" w:bidi="hi-IN"/>
     </w:rPr>
   </w:style>
-  <w:style w:type="character" w:styleId="DefaultParagraphFont" w:default="1">
+  <w:style w:type="character" w:styleId="DefaultParagraphFont">
     <w:name w:val="Default Paragraph Font"/>
     <w:qFormat/>
     <w:rPr/>
@@ -3570,13 +3494,6 @@
     <w:name w:val="Hyperlink"/>
     <w:rPr>
       <w:u w:val="single" w:color="FFFFFF"/>
-    </w:rPr>
-  </w:style>
-  <w:style w:type="character" w:styleId="NoneA">
-    <w:name w:val="None A"/>
-    <w:qFormat/>
-    <w:rPr>
-      <w:lang w:val="de-DE"/>
     </w:rPr>
   </w:style>
   <w:style w:type="character" w:styleId="None">
@@ -3606,10 +3523,6 @@
       <w:color w:val="0563C1"/>
       <w:u w:val="single" w:color="0563C1"/>
     </w:rPr>
-  </w:style>
-  <w:style w:type="character" w:styleId="LineNumber">
-    <w:name w:val="line number"/>
-    <w:rPr/>
   </w:style>
   <w:style w:type="paragraph" w:styleId="Heading">
     <w:name w:val="Heading"/>
@@ -3677,10 +3590,10 @@
       <w:keepLines w:val="false"/>
       <w:pageBreakBefore w:val="false"/>
       <w:widowControl/>
-      <w:shd w:val="clear" w:color="auto" w:fill="auto"/>
       <w:suppressAutoHyphens w:val="false"/>
+      <w:overflowPunct w:val="false"/>
       <w:bidi w:val="0"/>
-      <w:spacing w:lineRule="auto" w:line="300" w:beforeAutospacing="0" w:before="180" w:afterAutospacing="0" w:after="120"/>
+      <w:spacing w:lineRule="auto" w:line="300" w:before="180" w:after="120"/>
       <w:ind w:hanging="0" w:start="0" w:end="0"/>
       <w:jc w:val="start"/>
     </w:pPr>
@@ -3705,14 +3618,10 @@
       <w:position w:val="0"/>
       <w:sz w:val="20"/>
       <w:szCs w:val="20"/>
-      <w:u w:val="none" w:color="000000"/>
+      <w:u w:val="none"/>
       <w:shd w:fill="auto" w:val="clear"/>
       <w:vertAlign w:val="baseline"/>
       <w:lang w:val="de-DE" w:eastAsia="zh-CN" w:bidi="hi-IN"/>
-      <w14:textOutline w14:w="12700" w14:cap="flat">
-        <w14:noFill/>
-        <w14:miter w14:lim="400000"/>
-      </w14:textOutline>
     </w:rPr>
   </w:style>
   <w:style w:type="paragraph" w:styleId="HeaderFooter">
@@ -3723,14 +3632,14 @@
       <w:keepLines w:val="false"/>
       <w:pageBreakBefore w:val="false"/>
       <w:widowControl/>
-      <w:shd w:val="clear" w:color="auto" w:fill="auto"/>
       <w:tabs>
         <w:tab w:val="clear" w:pos="708"/>
         <w:tab w:val="right" w:pos="9020" w:leader="none"/>
       </w:tabs>
       <w:suppressAutoHyphens w:val="false"/>
+      <w:overflowPunct w:val="false"/>
       <w:bidi w:val="0"/>
-      <w:spacing w:lineRule="auto" w:line="240" w:beforeAutospacing="0" w:before="0" w:afterAutospacing="0" w:after="0"/>
+      <w:spacing w:lineRule="auto" w:line="240" w:before="0" w:after="0"/>
       <w:ind w:hanging="0" w:start="0" w:end="0"/>
       <w:jc w:val="start"/>
     </w:pPr>
@@ -3755,13 +3664,10 @@
       <w:position w:val="0"/>
       <w:sz w:val="24"/>
       <w:szCs w:val="24"/>
-      <w:u w:val="none" w:color="FFFFFF"/>
+      <w:u w:val="none"/>
       <w:shd w:fill="auto" w:val="clear"/>
       <w:vertAlign w:val="baseline"/>
       <w:lang w:val="en-US" w:eastAsia="zh-CN" w:bidi="hi-IN"/>
-      <w14:textOutline>
-        <w14:noFill/>
-      </w14:textOutline>
     </w:rPr>
   </w:style>
   <w:style w:type="paragraph" w:styleId="TitleA">
@@ -3772,10 +3678,10 @@
       <w:keepLines w:val="false"/>
       <w:pageBreakBefore w:val="false"/>
       <w:widowControl/>
-      <w:shd w:val="clear" w:color="auto" w:fill="auto"/>
       <w:suppressAutoHyphens w:val="false"/>
+      <w:overflowPunct w:val="false"/>
       <w:bidi w:val="0"/>
-      <w:spacing w:lineRule="auto" w:line="300" w:beforeAutospacing="0" w:before="180" w:afterAutospacing="0" w:after="120"/>
+      <w:spacing w:lineRule="auto" w:line="300" w:before="180" w:after="120"/>
       <w:ind w:hanging="0" w:start="0" w:end="0"/>
       <w:jc w:val="start"/>
     </w:pPr>
@@ -3800,7 +3706,7 @@
       <w:position w:val="0"/>
       <w:sz w:val="40"/>
       <w:szCs w:val="40"/>
-      <w:u w:val="none" w:color="000000"/>
+      <w:u w:val="none"/>
       <w:shd w:fill="auto" w:val="clear"/>
       <w:vertAlign w:val="baseline"/>
       <w:lang w:val="de-DE" w:eastAsia="zh-CN" w:bidi="hi-IN"/>
@@ -3814,10 +3720,10 @@
       <w:keepLines w:val="false"/>
       <w:pageBreakBefore w:val="false"/>
       <w:widowControl/>
-      <w:shd w:val="clear" w:color="auto" w:fill="auto"/>
       <w:suppressAutoHyphens w:val="false"/>
+      <w:overflowPunct w:val="false"/>
       <w:bidi w:val="0"/>
-      <w:spacing w:lineRule="auto" w:line="300" w:beforeAutospacing="0" w:before="180" w:afterAutospacing="0" w:after="120"/>
+      <w:spacing w:lineRule="auto" w:line="300" w:before="180" w:after="120"/>
       <w:ind w:hanging="0" w:start="0" w:end="0"/>
       <w:jc w:val="start"/>
     </w:pPr>
@@ -3842,7 +3748,7 @@
       <w:position w:val="0"/>
       <w:sz w:val="20"/>
       <w:szCs w:val="20"/>
-      <w:u w:val="none" w:color="000000"/>
+      <w:u w:val="none"/>
       <w:shd w:fill="auto" w:val="clear"/>
       <w:vertAlign w:val="baseline"/>
       <w:lang w:val="de-DE" w:eastAsia="zh-CN" w:bidi="hi-IN"/>
@@ -3856,10 +3762,10 @@
       <w:keepLines w:val="false"/>
       <w:pageBreakBefore w:val="false"/>
       <w:widowControl/>
-      <w:shd w:val="clear" w:color="auto" w:fill="auto"/>
       <w:suppressAutoHyphens w:val="false"/>
+      <w:overflowPunct w:val="false"/>
       <w:bidi w:val="0"/>
-      <w:spacing w:lineRule="auto" w:line="300" w:beforeAutospacing="0" w:before="180" w:afterAutospacing="0" w:after="120"/>
+      <w:spacing w:lineRule="auto" w:line="300" w:before="180" w:after="120"/>
       <w:ind w:hanging="0" w:start="0" w:end="0"/>
       <w:jc w:val="start"/>
     </w:pPr>
@@ -3884,7 +3790,7 @@
       <w:position w:val="0"/>
       <w:sz w:val="20"/>
       <w:szCs w:val="20"/>
-      <w:u w:val="none" w:color="000000"/>
+      <w:u w:val="none"/>
       <w:shd w:fill="auto" w:val="clear"/>
       <w:vertAlign w:val="baseline"/>
       <w:lang w:val="de-DE" w:eastAsia="zh-CN" w:bidi="hi-IN"/>
@@ -3904,10 +3810,11 @@
         <w:bottom w:val="single" w:sz="2" w:space="0" w:color="000000"/>
         <w:right w:val="single" w:sz="2" w:space="0" w:color="000000"/>
       </w:pBdr>
-      <w:shd w:val="clear" w:color="auto" w:fill="F2F6F8"/>
+      <w:shd w:val="clear" w:fill="F2F6F8"/>
       <w:suppressAutoHyphens w:val="false"/>
+      <w:overflowPunct w:val="false"/>
       <w:bidi w:val="0"/>
-      <w:spacing w:lineRule="auto" w:line="360" w:beforeAutospacing="0" w:before="60" w:afterAutospacing="0" w:after="0"/>
+      <w:spacing w:lineRule="auto" w:line="360" w:before="60" w:after="0"/>
       <w:ind w:hanging="0" w:start="0" w:end="0"/>
       <w:jc w:val="start"/>
     </w:pPr>
@@ -3932,7 +3839,7 @@
       <w:position w:val="0"/>
       <w:sz w:val="20"/>
       <w:szCs w:val="20"/>
-      <w:u w:val="none" w:color="000000"/>
+      <w:u w:val="none"/>
       <w:shd w:fill="auto" w:val="clear"/>
       <w:vertAlign w:val="baseline"/>
       <w:lang w:val="de-DE" w:eastAsia="zh-CN" w:bidi="hi-IN"/>
@@ -3946,10 +3853,11 @@
       <w:keepLines w:val="false"/>
       <w:pageBreakBefore w:val="false"/>
       <w:widowControl/>
-      <w:shd w:val="clear" w:color="auto" w:fill="FFF9D2"/>
+      <w:shd w:val="clear" w:fill="FFF9D2"/>
       <w:suppressAutoHyphens w:val="false"/>
+      <w:overflowPunct w:val="false"/>
       <w:bidi w:val="0"/>
-      <w:spacing w:lineRule="auto" w:line="300" w:beforeAutospacing="0" w:before="180" w:afterAutospacing="0" w:after="120"/>
+      <w:spacing w:lineRule="auto" w:line="300" w:before="180" w:after="120"/>
       <w:ind w:hanging="0" w:start="0" w:end="0"/>
       <w:jc w:val="start"/>
     </w:pPr>
@@ -3974,7 +3882,7 @@
       <w:position w:val="0"/>
       <w:sz w:val="20"/>
       <w:szCs w:val="20"/>
-      <w:u w:val="none" w:color="000000"/>
+      <w:u w:val="none"/>
       <w:shd w:fill="auto" w:val="clear"/>
       <w:vertAlign w:val="baseline"/>
       <w:lang w:val="de-DE" w:eastAsia="zh-CN" w:bidi="hi-IN"/>
@@ -3988,10 +3896,10 @@
       <w:keepLines w:val="false"/>
       <w:pageBreakBefore w:val="false"/>
       <w:widowControl/>
-      <w:shd w:val="clear" w:color="auto" w:fill="auto"/>
       <w:suppressAutoHyphens w:val="false"/>
+      <w:overflowPunct w:val="false"/>
       <w:bidi w:val="0"/>
-      <w:spacing w:lineRule="auto" w:line="300" w:beforeAutospacing="0" w:before="240" w:afterAutospacing="0" w:after="0"/>
+      <w:spacing w:lineRule="auto" w:line="300" w:before="240" w:after="0"/>
       <w:ind w:hanging="0" w:start="708" w:end="0"/>
       <w:jc w:val="start"/>
     </w:pPr>
@@ -4016,7 +3924,7 @@
       <w:position w:val="0"/>
       <w:sz w:val="16"/>
       <w:szCs w:val="16"/>
-      <w:u w:val="none" w:color="000000"/>
+      <w:u w:val="none"/>
       <w:shd w:fill="auto" w:val="clear"/>
       <w:vertAlign w:val="baseline"/>
       <w:lang w:val="de-DE" w:eastAsia="zh-CN" w:bidi="hi-IN"/>
@@ -4041,6 +3949,16 @@
     <w:pPr/>
     <w:rPr/>
   </w:style>
+  <w:style w:type="paragraph" w:styleId="TableContents">
+    <w:name w:val="Table Contents"/>
+    <w:basedOn w:val="Normal"/>
+    <w:qFormat/>
+    <w:pPr>
+      <w:widowControl w:val="false"/>
+      <w:suppressLineNumbers/>
+    </w:pPr>
+    <w:rPr/>
+  </w:style>
   <w:style w:type="paragraph" w:styleId="PreformattedText">
     <w:name w:val="Preformatted Text"/>
     <w:basedOn w:val="Normal"/>
@@ -4054,52 +3972,20 @@
       <w:szCs w:val="20"/>
     </w:rPr>
   </w:style>
-  <w:style w:type="numbering" w:styleId="NoList" w:default="1">
+  <w:style w:type="paragraph" w:styleId="FrameContentsuser">
+    <w:name w:val="Frame Contents (user)"/>
+    <w:basedOn w:val="Normal"/>
+    <w:qFormat/>
+    <w:pPr/>
+    <w:rPr/>
+  </w:style>
+  <w:style w:type="numbering" w:styleId="NoList">
     <w:name w:val="No List"/>
     <w:qFormat/>
   </w:style>
   <w:style w:type="numbering" w:styleId="ImportedStyle3">
     <w:name w:val="Imported Style 3"/>
     <w:qFormat/>
-  </w:style>
-  <w:style w:type="table" w:default="1" w:styleId="Table Normal">
-    <w:name w:val="Table Normal"/>
-    <w:tblStylePr w:type="firstRow">
-      <w:tblPr/>
-    </w:tblStylePr>
-    <w:tblStylePr w:type="lastRow">
-      <w:tblPr/>
-    </w:tblStylePr>
-    <w:tblStylePr w:type="firstCol">
-      <w:tblPr/>
-    </w:tblStylePr>
-    <w:tblStylePr w:type="lastCol">
-      <w:tblPr/>
-    </w:tblStylePr>
-    <w:tblStylePr w:type="band1Vert">
-      <w:tblPr/>
-    </w:tblStylePr>
-    <w:tblStylePr w:type="band2Vert">
-      <w:tblPr/>
-    </w:tblStylePr>
-    <w:tblStylePr w:type="band1Horz">
-      <w:tblPr/>
-    </w:tblStylePr>
-    <w:tblStylePr w:type="band2Horz">
-      <w:tblPr/>
-    </w:tblStylePr>
-    <w:tblStylePr w:type="neCell">
-      <w:tblPr/>
-    </w:tblStylePr>
-    <w:tblStylePr w:type="nwCell">
-      <w:tblPr/>
-    </w:tblStylePr>
-    <w:tblStylePr w:type="seCell">
-      <w:tblPr/>
-    </w:tblStylePr>
-    <w:tblStylePr w:type="swCell">
-      <w:tblPr/>
-    </w:tblStylePr>
   </w:style>
 </w:styles>
 </file>
@@ -4147,14 +4033,14 @@
     </a:clrScheme>
     <a:fontScheme name="Office">
       <a:majorFont>
-        <a:latin typeface="Helvetica Neue" pitchFamily="0" charset="1"/>
-        <a:ea typeface="Helvetica Neue" pitchFamily="0" charset="1"/>
-        <a:cs typeface="Helvetica Neue" pitchFamily="0" charset="1"/>
+        <a:latin typeface="Arial" pitchFamily="0" charset="1"/>
+        <a:ea typeface="DejaVu Sans" pitchFamily="0" charset="1"/>
+        <a:cs typeface="DejaVu Sans" pitchFamily="0" charset="1"/>
       </a:majorFont>
       <a:minorFont>
-        <a:latin typeface="Helvetica Neue" pitchFamily="0" charset="1"/>
-        <a:ea typeface="Helvetica Neue" pitchFamily="0" charset="1"/>
-        <a:cs typeface="Helvetica Neue" pitchFamily="0" charset="1"/>
+        <a:latin typeface="Arial" pitchFamily="0" charset="1"/>
+        <a:ea typeface="DejaVu Sans" pitchFamily="0" charset="1"/>
+        <a:cs typeface="DejaVu Sans" pitchFamily="0" charset="1"/>
       </a:minorFont>
     </a:fontScheme>
     <a:fmtScheme>
@@ -4162,55 +4048,25 @@
         <a:solidFill>
           <a:schemeClr val="phClr"/>
         </a:solidFill>
-        <a:gradFill>
-          <a:gsLst>
-            <a:gs pos="0">
-              <a:schemeClr val="phClr">
-                <a:tint val="50000"/>
-              </a:schemeClr>
-            </a:gs>
-            <a:gs pos="35000">
-              <a:schemeClr val="phClr">
-                <a:tint val="37000"/>
-              </a:schemeClr>
-            </a:gs>
-            <a:gs pos="100000">
-              <a:schemeClr val="phClr">
-                <a:tint val="15000"/>
-              </a:schemeClr>
-            </a:gs>
-          </a:gsLst>
-          <a:lin ang="16200000" scaled="1"/>
-          <a:tileRect l="0" t="0" r="0" b="0"/>
-        </a:gradFill>
-        <a:gradFill>
-          <a:gsLst>
-            <a:gs pos="0">
-              <a:schemeClr val="phClr">
-                <a:tint val="100000"/>
-                <a:shade val="100000"/>
-              </a:schemeClr>
-            </a:gs>
-            <a:gs pos="100000">
-              <a:schemeClr val="phClr">
-                <a:tint val="50000"/>
-                <a:shade val="100000"/>
-              </a:schemeClr>
-            </a:gs>
-          </a:gsLst>
-          <a:lin ang="16200000" scaled="0"/>
-          <a:tileRect l="0" t="0" r="0" b="0"/>
-        </a:gradFill>
+        <a:solidFill>
+          <a:schemeClr val="phClr"/>
+        </a:solidFill>
+        <a:solidFill>
+          <a:schemeClr val="phClr"/>
+        </a:solidFill>
       </a:fillStyleLst>
       <a:lnStyleLst>
-        <a:ln w="9525" cap="flat" cmpd="sng" algn="ctr">
+        <a:ln w="6350" cap="flat" cmpd="sng" algn="ctr">
           <a:prstDash val="solid"/>
+          <a:miter/>
         </a:ln>
-        <a:ln w="25400" cap="flat" cmpd="sng" algn="ctr">
+        <a:ln w="6350" cap="flat" cmpd="sng" algn="ctr">
           <a:prstDash val="solid"/>
+          <a:miter/>
         </a:ln>
-        <a:ln w="38100" cap="flat" cmpd="sng" algn="ctr">
+        <a:ln w="6350" cap="flat" cmpd="sng" algn="ctr">
           <a:prstDash val="solid"/>
+          <a:miter/>
         </a:ln>
       </a:lnStyleLst>
       <a:effectStyleLst>
@@ -4228,48 +4084,12 @@
         <a:solidFill>
           <a:schemeClr val="phClr"/>
         </a:solidFill>
-        <a:gradFill>
-          <a:gsLst>
-            <a:gs pos="0">
-              <a:schemeClr val="phClr">
-                <a:tint val="40000"/>
-              </a:schemeClr>
-            </a:gs>
-            <a:gs pos="40000">
-              <a:schemeClr val="phClr">
-                <a:tint val="45000"/>
-                <a:shade val="99000"/>
-              </a:schemeClr>
-            </a:gs>
-            <a:gs pos="100000">
-              <a:schemeClr val="phClr">
-                <a:shade val="20000"/>
-              </a:schemeClr>
-            </a:gs>
-          </a:gsLst>
-          <a:path path="circle">
-            <a:fillToRect l="50000" t="-80000" r="50000" b="180000"/>
-          </a:path>
-          <a:tileRect l="0" t="0" r="0" b="0"/>
-        </a:gradFill>
-        <a:gradFill>
-          <a:gsLst>
-            <a:gs pos="0">
-              <a:schemeClr val="phClr">
-                <a:tint val="80000"/>
-              </a:schemeClr>
-            </a:gs>
-            <a:gs pos="100000">
-              <a:schemeClr val="phClr">
-                <a:shade val="30000"/>
-              </a:schemeClr>
-            </a:gs>
-          </a:gsLst>
-          <a:path path="circle">
-            <a:fillToRect l="50000" t="50000" r="50000" b="50000"/>
-          </a:path>
-          <a:tileRect l="0" t="0" r="0" b="0"/>
-        </a:gradFill>
+        <a:solidFill>
+          <a:schemeClr val="phClr"/>
+        </a:solidFill>
+        <a:solidFill>
+          <a:schemeClr val="phClr"/>
+        </a:solidFill>
       </a:bgFillStyleLst>
     </a:fmtScheme>
   </a:themeElements>

</xml_diff>

<commit_message>
fix: typo in documentation template
</commit_message>
<xml_diff>
--- a/public/documents/TEMPLATE_Dokumentation_der_Digitaltauglichkeit.docx
+++ b/public/documents/TEMPLATE_Dokumentation_der_Digitaltauglichkeit.docx
@@ -1,8 +1,8 @@
 
 <file path=word/document.xml><?xml version="1.0" encoding="utf-8"?>
-<w:document xmlns:r="http://schemas.openxmlformats.org/officeDocument/2006/relationships" xmlns:wp="http://schemas.openxmlformats.org/drawingml/2006/wordprocessingDrawing" xmlns:w="http://schemas.openxmlformats.org/wordprocessingml/2006/main" xmlns:w10="urn:schemas-microsoft-com:office:word" xmlns:w14="http://schemas.microsoft.com/office/word/2010/wordml" xmlns:wps="http://schemas.microsoft.com/office/word/2010/wordprocessingShape" xmlns:wpg="http://schemas.microsoft.com/office/word/2010/wordprocessingGroup" xmlns:mc="http://schemas.openxmlformats.org/markup-compatibility/2006" xmlns:v="urn:schemas-microsoft-com:vml" xmlns:o="urn:schemas-microsoft-com:office:office" xmlns:m="http://schemas.openxmlformats.org/officeDocument/2006/math" mc:Ignorable="w14">
+<w:document xmlns:wp14="http://schemas.microsoft.com/office/word/2010/wordprocessingDrawing" xmlns:r="http://schemas.openxmlformats.org/officeDocument/2006/relationships" xmlns:wp="http://schemas.openxmlformats.org/drawingml/2006/wordprocessingDrawing" xmlns:w="http://schemas.openxmlformats.org/wordprocessingml/2006/main" xmlns:w10="urn:schemas-microsoft-com:office:word" xmlns:w14="http://schemas.microsoft.com/office/word/2010/wordml" xmlns:wps="http://schemas.microsoft.com/office/word/2010/wordprocessingShape" xmlns:wpg="http://schemas.microsoft.com/office/word/2010/wordprocessingGroup" xmlns:mc="http://schemas.openxmlformats.org/markup-compatibility/2006" xmlns:v="urn:schemas-microsoft-com:vml" xmlns:o="urn:schemas-microsoft-com:office:office" xmlns:m="http://schemas.openxmlformats.org/officeDocument/2006/math" mc:Ignorable="w14 wp14">
   <w:body>
-    <w:p>
+    <w:p xmlns:wp14="http://schemas.microsoft.com/office/word/2010/wordml" wp14:textId="77777777">
       <w:pPr>
         <w:pStyle w:val="Title A"/>
         <w:keepNext w:val="1"/>
@@ -21,7 +21,7 @@
         <w:t>Dokumentation der Digitaltauglichkeit</w:t>
       </w:r>
     </w:p>
-    <w:p>
+    <w:p xmlns:wp14="http://schemas.microsoft.com/office/word/2010/wordml" wp14:textId="77777777">
       <w:pPr>
         <w:pStyle w:val="Normal0"/>
       </w:pPr>
@@ -54,7 +54,7 @@
         <w:gridCol w:w="5315"/>
         <w:gridCol w:w="3757"/>
       </w:tblGrid>
-      <w:tr>
+      <w:tr xmlns:wp14="http://schemas.microsoft.com/office/word/2010/wordml" wp14:textId="77777777">
         <w:tblPrEx>
           <w:shd w:val="clear" w:color="auto" w:fill="cad1d7"/>
         </w:tblPrEx>
@@ -63,7 +63,7 @@
         </w:trPr>
         <w:tc>
           <w:tcPr>
-            <w:tcW w:type="dxa" w:w="5315"/>
+            <w:tcW w:w="5315" w:type="dxa"/>
             <w:tcBorders>
               <w:top w:val="nil"/>
               <w:left w:val="nil"/>
@@ -72,14 +72,14 @@
             </w:tcBorders>
             <w:shd w:val="clear" w:color="auto" w:fill="auto"/>
             <w:tcMar>
-              <w:top w:type="dxa" w:w="80"/>
-              <w:left w:type="dxa" w:w="80"/>
-              <w:bottom w:type="dxa" w:w="80"/>
-              <w:right w:type="dxa" w:w="80"/>
+              <w:top w:w="80" w:type="dxa"/>
+              <w:left w:w="80" w:type="dxa"/>
+              <w:bottom w:w="80" w:type="dxa"/>
+              <w:right w:w="80" w:type="dxa"/>
             </w:tcMar>
             <w:vAlign w:val="top"/>
           </w:tcPr>
-          <w:p>
+          <w:p wp14:textId="77777777">
             <w:pPr>
               <w:pStyle w:val="heading 2"/>
               <w:rPr>
@@ -95,7 +95,7 @@
               <w:t>So funktioniert es</w:t>
             </w:r>
           </w:p>
-          <w:p>
+          <w:p wp14:textId="77777777">
             <w:pPr>
               <w:pStyle w:val="List Paragraph"/>
               <w:numPr>
@@ -119,7 +119,7 @@
               <w:t>Bearbeiten Sie die Dokumentation.</w:t>
             </w:r>
           </w:p>
-          <w:p>
+          <w:p wp14:textId="77777777">
             <w:pPr>
               <w:pStyle w:val="List Paragraph"/>
               <w:numPr>
@@ -159,7 +159,7 @@
               <w:t>llte Dokumentation an den NKR.</w:t>
             </w:r>
           </w:p>
-          <w:p>
+          <w:p wp14:textId="77777777">
             <w:pPr>
               <w:pStyle w:val="List Paragraph"/>
               <w:numPr>
@@ -297,7 +297,7 @@
               <w:t>ft die methodische und inhaltliche Nachvollziehbarkeit. Bei Fragen wird der NKR auf Sie zukommen. Das Ziel ist eine digital- und praxistaugliche Umsetzung.</w:t>
             </w:r>
           </w:p>
-          <w:p>
+          <w:p wp14:textId="77777777">
             <w:pPr>
               <w:pStyle w:val="List Paragraph"/>
               <w:numPr>
@@ -442,7 +442,7 @@
               <w:t>.</w:t>
             </w:r>
           </w:p>
-          <w:p>
+          <w:p wp14:textId="77777777">
             <w:pPr>
               <w:pStyle w:val="List Paragraph"/>
               <w:numPr>
@@ -499,7 +499,7 @@
         </w:tc>
         <w:tc>
           <w:tcPr>
-            <w:tcW w:type="dxa" w:w="3757"/>
+            <w:tcW w:w="3757" w:type="dxa"/>
             <w:tcBorders>
               <w:top w:val="nil"/>
               <w:left w:val="nil"/>
@@ -508,14 +508,14 @@
             </w:tcBorders>
             <w:shd w:val="clear" w:color="auto" w:fill="fff9d2"/>
             <w:tcMar>
-              <w:top w:type="dxa" w:w="80"/>
-              <w:left w:type="dxa" w:w="80"/>
-              <w:bottom w:type="dxa" w:w="80"/>
-              <w:right w:type="dxa" w:w="80"/>
+              <w:top w:w="80" w:type="dxa"/>
+              <w:left w:w="80" w:type="dxa"/>
+              <w:bottom w:w="80" w:type="dxa"/>
+              <w:right w:w="80" w:type="dxa"/>
             </w:tcMar>
             <w:vAlign w:val="top"/>
           </w:tcPr>
-          <w:p>
+          <w:p wp14:textId="77777777">
             <w:pPr>
               <w:pStyle w:val="heading 2"/>
               <w:spacing w:line="276" w:lineRule="auto"/>
@@ -534,7 +534,7 @@
               <w:t>Tipps</w:t>
             </w:r>
           </w:p>
-          <w:p>
+          <w:p wp14:textId="77777777">
             <w:pPr>
               <w:pStyle w:val="Fett1"/>
               <w:bidi w:val="0"/>
@@ -627,7 +627,7 @@
               <w:t>ngenden Regelungen eines Vorhabens aus.</w:t>
             </w:r>
           </w:p>
-          <w:p>
+          <w:p wp14:textId="77777777">
             <w:pPr>
               <w:pStyle w:val="Normal0"/>
               <w:bidi w:val="0"/>
@@ -676,7 +676,7 @@
               <w:t>nge besser erkennen.</w:t>
             </w:r>
           </w:p>
-          <w:p>
+          <w:p wp14:textId="77777777">
             <w:pPr>
               <w:pStyle w:val="Fett1"/>
               <w:bidi w:val="0"/>
@@ -703,7 +703,7 @@
               <w:t>Holen Sie sich eine zweite Meinung ein.</w:t>
             </w:r>
           </w:p>
-          <w:p>
+          <w:p wp14:textId="77777777">
             <w:pPr>
               <w:pStyle w:val="Normal0"/>
               <w:bidi w:val="0"/>
@@ -730,7 +730,7 @@
               <w:t>Senden Sie das fertige Dokument oder einen Zwischenstand an eine Kollegin oder einen Kollegen.</w:t>
             </w:r>
           </w:p>
-          <w:p>
+          <w:p wp14:textId="77777777">
             <w:pPr>
               <w:pStyle w:val="Fett1"/>
               <w:bidi w:val="0"/>
@@ -757,7 +757,7 @@
               <w:t>Nehmen Sie Ihre Visualisierung als Grundlage</w:t>
             </w:r>
           </w:p>
-          <w:p>
+          <w:p wp14:textId="77777777">
             <w:pPr>
               <w:pStyle w:val="Normal0"/>
               <w:bidi w:val="0"/>
@@ -870,7 +870,7 @@
         </w:tc>
       </w:tr>
     </w:tbl>
-    <w:p>
+    <w:p xmlns:wp14="http://schemas.microsoft.com/office/word/2010/wordml" wp14:textId="77777777">
       <w:pPr>
         <w:pStyle w:val="Normal0"/>
         <w:widowControl w:val="0"/>
@@ -878,7 +878,7 @@
         <w:ind w:left="648" w:hanging="648"/>
       </w:pPr>
     </w:p>
-    <w:p>
+    <w:p xmlns:wp14="http://schemas.microsoft.com/office/word/2010/wordml" wp14:textId="77777777">
       <w:pPr>
         <w:pStyle w:val="Normal0"/>
         <w:widowControl w:val="0"/>
@@ -886,7 +886,7 @@
         <w:ind w:left="540" w:hanging="540"/>
       </w:pPr>
     </w:p>
-    <w:p>
+    <w:p xmlns:wp14="http://schemas.microsoft.com/office/word/2010/wordml" wp14:textId="77777777">
       <w:pPr>
         <w:pStyle w:val="Normal0"/>
         <w:widowControl w:val="0"/>
@@ -894,7 +894,7 @@
         <w:ind w:left="432" w:hanging="432"/>
       </w:pPr>
     </w:p>
-    <w:p>
+    <w:p xmlns:wp14="http://schemas.microsoft.com/office/word/2010/wordml" wp14:textId="77777777">
       <w:pPr>
         <w:pStyle w:val="Normal0"/>
         <w:widowControl w:val="0"/>
@@ -902,7 +902,7 @@
         <w:ind w:left="324" w:hanging="324"/>
       </w:pPr>
     </w:p>
-    <w:p>
+    <w:p xmlns:wp14="http://schemas.microsoft.com/office/word/2010/wordml" wp14:textId="77777777">
       <w:pPr>
         <w:pStyle w:val="Normal0"/>
         <w:widowControl w:val="0"/>
@@ -910,7 +910,7 @@
         <w:ind w:left="216" w:hanging="216"/>
       </w:pPr>
     </w:p>
-    <w:p>
+    <w:p xmlns:wp14="http://schemas.microsoft.com/office/word/2010/wordml" wp14:textId="77777777">
       <w:pPr>
         <w:pStyle w:val="Normal0"/>
         <w:widowControl w:val="0"/>
@@ -918,14 +918,14 @@
         <w:ind w:left="108" w:hanging="108"/>
       </w:pPr>
     </w:p>
-    <w:p>
+    <w:p xmlns:wp14="http://schemas.microsoft.com/office/word/2010/wordml" wp14:textId="77777777">
       <w:pPr>
         <w:pStyle w:val="Normal0"/>
         <w:widowControl w:val="0"/>
         <w:spacing w:line="240" w:lineRule="auto"/>
       </w:pPr>
     </w:p>
-    <w:p>
+    <w:p xmlns:wp14="http://schemas.microsoft.com/office/word/2010/wordml" wp14:textId="77777777">
       <w:pPr>
         <w:pStyle w:val="Normal0"/>
         <w:pBdr>
@@ -941,7 +941,7 @@
         </w:rPr>
       </w:pPr>
     </w:p>
-    <w:p>
+    <w:p xmlns:wp14="http://schemas.microsoft.com/office/word/2010/wordml" wp14:textId="098FCF76">
       <w:pPr>
         <w:pStyle w:val="heading 1"/>
         <w:spacing w:before="720"/>
@@ -956,13 +956,12 @@
           <w:rStyle w:val="None"/>
           <w:b w:val="1"/>
           <w:bCs w:val="1"/>
-          <w:rtl w:val="0"/>
-          <w:lang w:val="de-DE"/>
-        </w:rPr>
-        <w:t>1. Tragen Sie den Titel Ihres Regelungsvorhaben ein</w:t>
-      </w:r>
-    </w:p>
-    <w:p>
+          <w:lang w:val="de-DE"/>
+        </w:rPr>
+        <w:t>1. Tragen Sie den Titel Ihres Regelungsvorhabens ein</w:t>
+      </w:r>
+    </w:p>
+    <w:p xmlns:wp14="http://schemas.microsoft.com/office/word/2010/wordml" wp14:textId="77777777">
       <w:pPr>
         <w:pStyle w:val="Textbox"/>
       </w:pPr>
@@ -974,7 +973,7 @@
         <w:t>{{POLICY_TITLE}}</w:t>
       </w:r>
     </w:p>
-    <w:p>
+    <w:p xmlns:wp14="http://schemas.microsoft.com/office/word/2010/wordml" wp14:textId="77777777">
       <w:pPr>
         <w:pStyle w:val="heading 1"/>
         <w:spacing w:before="600"/>
@@ -995,7 +994,7 @@
         <w:t>2. Auswirkungen auf Betroffene und an der Umsetzung Beteiligte</w:t>
       </w:r>
     </w:p>
-    <w:p>
+    <w:p xmlns:wp14="http://schemas.microsoft.com/office/word/2010/wordml" wp14:textId="77777777">
       <w:pPr>
         <w:pStyle w:val="Normal0"/>
         <w:keepNext w:val="1"/>
@@ -1094,7 +1093,7 @@
         <w:t>rden) gerecht werden.</w:t>
       </w:r>
     </w:p>
-    <w:p>
+    <w:p xmlns:wp14="http://schemas.microsoft.com/office/word/2010/wordml" wp14:textId="77777777">
       <w:pPr>
         <w:pStyle w:val="heading 2"/>
       </w:pPr>
@@ -1148,7 +1147,7 @@
         <w:t>ft?</w:t>
       </w:r>
     </w:p>
-    <w:p>
+    <w:p xmlns:wp14="http://schemas.microsoft.com/office/word/2010/wordml" wp14:textId="77777777">
       <w:pPr>
         <w:pStyle w:val="Textbox"/>
       </w:pPr>
@@ -1160,7 +1159,7 @@
         <w:t>{{PARTICIPATION_FORMATS}}</w:t>
       </w:r>
     </w:p>
-    <w:p>
+    <w:p xmlns:wp14="http://schemas.microsoft.com/office/word/2010/wordml" wp14:textId="77777777">
       <w:pPr>
         <w:pStyle w:val="heading 2"/>
       </w:pPr>
@@ -1172,7 +1171,7 @@
         <w:t>Wie spiegeln sich die Erkenntnisse, die durch die oben genannten Schritte gewonnen wurde, im Regelungsvorhaben wider?</w:t>
       </w:r>
     </w:p>
-    <w:p>
+    <w:p xmlns:wp14="http://schemas.microsoft.com/office/word/2010/wordml" wp14:textId="77777777">
       <w:pPr>
         <w:pStyle w:val="Textbox"/>
       </w:pPr>
@@ -1184,7 +1183,7 @@
         <w:t>{{PARTICIPATION_RESULTS}}</w:t>
       </w:r>
     </w:p>
-    <w:p>
+    <w:p xmlns:wp14="http://schemas.microsoft.com/office/word/2010/wordml" wp14:textId="77777777">
       <w:pPr>
         <w:pStyle w:val="Normal0"/>
         <w:rPr>
@@ -1228,7 +1227,7 @@
       </w:r>
       <w:bookmarkEnd w:id="0"/>
     </w:p>
-    <w:p>
+    <w:p xmlns:wp14="http://schemas.microsoft.com/office/word/2010/wordml" wp14:textId="77777777">
       <w:pPr>
         <w:pStyle w:val="Normal0"/>
       </w:pPr>
@@ -1249,7 +1248,7 @@
         <w:t>{{PRINCIPLE_1_DESCRIPTION}}</w:t>
       </w:r>
     </w:p>
-    <w:p>
+    <w:p xmlns:wp14="http://schemas.microsoft.com/office/word/2010/wordml" wp14:textId="77777777">
       <w:pPr>
         <w:pStyle w:val="heading 2"/>
       </w:pPr>
@@ -1275,7 +1274,7 @@
         <w:t>sst sich das Vorhaben im Sinne des Prinzips umsetzen?</w:t>
       </w:r>
     </w:p>
-    <w:p>
+    <w:p xmlns:wp14="http://schemas.microsoft.com/office/word/2010/wordml" wp14:textId="77777777">
       <w:pPr>
         <w:pStyle w:val="Erklärung Markierung"/>
       </w:pPr>
@@ -1301,7 +1300,7 @@
         <w:t>schen Sie raus, was nicht zutrifft:</w:t>
       </w:r>
     </w:p>
-    <w:p>
+    <w:p xmlns:wp14="http://schemas.microsoft.com/office/word/2010/wordml" wp14:textId="77777777">
       <w:pPr>
         <w:pStyle w:val="Textbox"/>
         <w:spacing w:before="120"/>
@@ -1315,7 +1314,7 @@
         <w:t>{{PRINCIPLE_1_ANSWER}}</w:t>
       </w:r>
     </w:p>
-    <w:p>
+    <w:p xmlns:wp14="http://schemas.microsoft.com/office/word/2010/wordml" wp14:textId="77777777">
       <w:pPr>
         <w:pStyle w:val="Erklärung Markierung"/>
         <w:spacing w:before="400"/>
@@ -1422,7 +1421,7 @@
         <w:t>nden Sie die Entscheidung und machen Sie bei Punkt 4 weiter.</w:t>
       </w:r>
     </w:p>
-    <w:p>
+    <w:p xmlns:wp14="http://schemas.microsoft.com/office/word/2010/wordml" wp14:textId="77777777">
       <w:pPr>
         <w:pStyle w:val="Textbox Label"/>
         <w:ind w:left="720" w:firstLine="0"/>
@@ -1487,7 +1486,7 @@
         <w:t>gbare Schwerpunkte: {{PRINCIPLE_1_ASPECTS_AVAILABLE}}</w:t>
       </w:r>
     </w:p>
-    <w:p>
+    <w:p xmlns:wp14="http://schemas.microsoft.com/office/word/2010/wordml" wp14:textId="77777777">
       <w:pPr>
         <w:pStyle w:val="Textbox Label"/>
         <w:ind w:left="720" w:firstLine="0"/>
@@ -1517,7 +1516,7 @@
         <w:t>hlte Schwerpunkte</w:t>
       </w:r>
     </w:p>
-    <w:p>
+    <w:p xmlns:wp14="http://schemas.microsoft.com/office/word/2010/wordml" wp14:textId="77777777">
       <w:pPr>
         <w:pStyle w:val="Textbox"/>
         <w:ind w:left="720" w:firstLine="0"/>
@@ -1531,7 +1530,7 @@
         <w:t>{{PRINCIPLE_1_ASPECTS}}</w:t>
       </w:r>
     </w:p>
-    <w:p>
+    <w:p xmlns:wp14="http://schemas.microsoft.com/office/word/2010/wordml" wp14:textId="77777777">
       <w:pPr>
         <w:pStyle w:val="Textbox Label"/>
         <w:ind w:left="720" w:firstLine="0"/>
@@ -1564,7 +1563,7 @@
         <w:t>uterung</w:t>
       </w:r>
     </w:p>
-    <w:p>
+    <w:p xmlns:wp14="http://schemas.microsoft.com/office/word/2010/wordml" wp14:textId="77777777">
       <w:pPr>
         <w:pStyle w:val="Textbox"/>
         <w:ind w:left="708" w:firstLine="0"/>
@@ -1578,7 +1577,7 @@
         <w:t>{{PRINCIPLE_1_REASONING}}</w:t>
       </w:r>
     </w:p>
-    <w:p>
+    <w:p xmlns:wp14="http://schemas.microsoft.com/office/word/2010/wordml" wp14:textId="77777777">
       <w:pPr>
         <w:pStyle w:val="Normal0"/>
         <w:rPr>
@@ -1598,8 +1597,6 @@
           <w:szCs w:val="32"/>
         </w:rPr>
         <w:br w:type="textWrapping"/>
-        <w:br w:type="textWrapping"/>
-        <w:br w:type="textWrapping"/>
       </w:r>
       <w:r>
         <w:rPr>
@@ -1608,12 +1605,9 @@
           <w:bCs w:val="1"/>
           <w:sz w:val="32"/>
           <w:szCs w:val="32"/>
-          <w:rtl w:val="0"/>
-          <w:lang w:val="de-DE"/>
-        </w:rPr>
-        <w:t xml:space="preserve">4. </w:t>
-      </w:r>
-      <w:bookmarkStart w:name="datenwiederverwendungbentigteinheitliche" w:id="1"/>
+        </w:rPr>
+        <w:br w:type="textWrapping"/>
+      </w:r>
       <w:r>
         <w:rPr>
           <w:rStyle w:val="None"/>
@@ -1621,6 +1615,29 @@
           <w:bCs w:val="1"/>
           <w:sz w:val="32"/>
           <w:szCs w:val="32"/>
+        </w:rPr>
+        <w:br w:type="textWrapping"/>
+      </w:r>
+      <w:r>
+        <w:rPr>
+          <w:rStyle w:val="None"/>
+          <w:b w:val="1"/>
+          <w:bCs w:val="1"/>
+          <w:sz w:val="32"/>
+          <w:szCs w:val="32"/>
+          <w:rtl w:val="0"/>
+          <w:lang w:val="de-DE"/>
+        </w:rPr>
+        <w:t xml:space="preserve">4. </w:t>
+      </w:r>
+      <w:bookmarkStart w:name="datenwiederverwendungbentigteinheitliche" w:id="1"/>
+      <w:r>
+        <w:rPr>
+          <w:rStyle w:val="None"/>
+          <w:b w:val="1"/>
+          <w:bCs w:val="1"/>
+          <w:sz w:val="32"/>
+          <w:szCs w:val="32"/>
           <w:rtl w:val="0"/>
           <w:lang w:val="de-DE"/>
         </w:rPr>
@@ -1628,7 +1645,7 @@
       </w:r>
       <w:bookmarkEnd w:id="1"/>
     </w:p>
-    <w:p>
+    <w:p xmlns:wp14="http://schemas.microsoft.com/office/word/2010/wordml" wp14:textId="77777777">
       <w:pPr>
         <w:pStyle w:val="Normal0"/>
       </w:pPr>
@@ -1640,7 +1657,7 @@
         <w:t>{{PRINCIPLE_2_DESCRIPTION}}</w:t>
       </w:r>
     </w:p>
-    <w:p>
+    <w:p xmlns:wp14="http://schemas.microsoft.com/office/word/2010/wordml" wp14:textId="77777777">
       <w:pPr>
         <w:pStyle w:val="heading 2"/>
       </w:pPr>
@@ -1666,7 +1683,7 @@
         <w:t>sst sich das Vorhaben im Sinne des Prinzips umsetzen?</w:t>
       </w:r>
     </w:p>
-    <w:p>
+    <w:p xmlns:wp14="http://schemas.microsoft.com/office/word/2010/wordml" wp14:textId="77777777">
       <w:pPr>
         <w:pStyle w:val="Erklärung Markierung"/>
       </w:pPr>
@@ -1692,7 +1709,7 @@
         <w:t>schen Sie raus, was nicht zutrifft:</w:t>
       </w:r>
     </w:p>
-    <w:p>
+    <w:p xmlns:wp14="http://schemas.microsoft.com/office/word/2010/wordml" wp14:textId="77777777">
       <w:pPr>
         <w:pStyle w:val="Textbox"/>
         <w:spacing w:before="120"/>
@@ -1706,7 +1723,7 @@
         <w:t>{{PRINCIPLE_2_ANSWER}}</w:t>
       </w:r>
     </w:p>
-    <w:p>
+    <w:p xmlns:wp14="http://schemas.microsoft.com/office/word/2010/wordml" wp14:textId="77777777">
       <w:pPr>
         <w:pStyle w:val="Erklärung Markierung"/>
         <w:spacing w:before="400"/>
@@ -1813,7 +1830,7 @@
         <w:t>nden Sie die Entscheidung und machen Sie bei Punkt 5 weiter.</w:t>
       </w:r>
     </w:p>
-    <w:p>
+    <w:p xmlns:wp14="http://schemas.microsoft.com/office/word/2010/wordml" wp14:textId="77777777">
       <w:pPr>
         <w:pStyle w:val="Textbox Label"/>
         <w:ind w:left="720" w:firstLine="0"/>
@@ -1878,7 +1895,7 @@
         <w:t>gbare Schwerpunkte: {{PRINCIPLE_2_ASPECTS_AVAILABLE}}</w:t>
       </w:r>
     </w:p>
-    <w:p>
+    <w:p xmlns:wp14="http://schemas.microsoft.com/office/word/2010/wordml" wp14:textId="77777777">
       <w:pPr>
         <w:pStyle w:val="Textbox Label"/>
         <w:ind w:left="720" w:firstLine="0"/>
@@ -1908,7 +1925,7 @@
         <w:t>hlte Schwerpunkte</w:t>
       </w:r>
     </w:p>
-    <w:p>
+    <w:p xmlns:wp14="http://schemas.microsoft.com/office/word/2010/wordml" wp14:textId="77777777">
       <w:pPr>
         <w:pStyle w:val="Textbox"/>
         <w:ind w:left="720" w:firstLine="0"/>
@@ -1922,7 +1939,7 @@
         <w:t>{{PRINCIPLE_2_ASPECTS}}</w:t>
       </w:r>
     </w:p>
-    <w:p>
+    <w:p xmlns:wp14="http://schemas.microsoft.com/office/word/2010/wordml" wp14:textId="77777777">
       <w:pPr>
         <w:pStyle w:val="Textbox Label"/>
         <w:ind w:left="720" w:firstLine="0"/>
@@ -1952,7 +1969,7 @@
         <w:t>uterung</w:t>
       </w:r>
     </w:p>
-    <w:p>
+    <w:p xmlns:wp14="http://schemas.microsoft.com/office/word/2010/wordml" wp14:textId="77777777">
       <w:pPr>
         <w:pStyle w:val="Textbox"/>
         <w:ind w:left="720" w:firstLine="0"/>
@@ -1966,7 +1983,7 @@
         <w:t>{{PRINCIPLE_2_REASONING}}</w:t>
       </w:r>
     </w:p>
-    <w:p>
+    <w:p xmlns:wp14="http://schemas.microsoft.com/office/word/2010/wordml" wp14:textId="77777777">
       <w:pPr>
         <w:pStyle w:val="Normal0"/>
         <w:rPr>
@@ -1986,7 +2003,6 @@
           <w:szCs w:val="32"/>
         </w:rPr>
         <w:br w:type="textWrapping"/>
-        <w:br w:type="textWrapping"/>
       </w:r>
       <w:r>
         <w:rPr>
@@ -1995,12 +2011,9 @@
           <w:bCs w:val="1"/>
           <w:sz w:val="32"/>
           <w:szCs w:val="32"/>
-          <w:rtl w:val="0"/>
-          <w:lang w:val="de-DE"/>
-        </w:rPr>
-        <w:t xml:space="preserve">5. </w:t>
-      </w:r>
-      <w:bookmarkStart w:name="etabliertetechnologienermglicheneffizien" w:id="2"/>
+        </w:rPr>
+        <w:br w:type="textWrapping"/>
+      </w:r>
       <w:r>
         <w:rPr>
           <w:rStyle w:val="None"/>
@@ -2011,11 +2024,24 @@
           <w:rtl w:val="0"/>
           <w:lang w:val="de-DE"/>
         </w:rPr>
+        <w:t xml:space="preserve">5. </w:t>
+      </w:r>
+      <w:bookmarkStart w:name="etabliertetechnologienermglicheneffizien" w:id="2"/>
+      <w:r>
+        <w:rPr>
+          <w:rStyle w:val="None"/>
+          <w:b w:val="1"/>
+          <w:bCs w:val="1"/>
+          <w:sz w:val="32"/>
+          <w:szCs w:val="32"/>
+          <w:rtl w:val="0"/>
+          <w:lang w:val="de-DE"/>
+        </w:rPr>
         <w:t>{{PRINCIPLE_3_TITLE}}</w:t>
       </w:r>
       <w:bookmarkEnd w:id="2"/>
     </w:p>
-    <w:p>
+    <w:p xmlns:wp14="http://schemas.microsoft.com/office/word/2010/wordml" wp14:textId="77777777">
       <w:pPr>
         <w:pStyle w:val="Normal0"/>
       </w:pPr>
@@ -2027,7 +2053,7 @@
         <w:t>{{PRINCIPLE_3_DESCRIPTION}}</w:t>
       </w:r>
     </w:p>
-    <w:p>
+    <w:p xmlns:wp14="http://schemas.microsoft.com/office/word/2010/wordml" wp14:textId="77777777">
       <w:pPr>
         <w:pStyle w:val="heading 2"/>
       </w:pPr>
@@ -2053,7 +2079,7 @@
         <w:t>sst sich das Vorhaben im Sinne des Prinzips umsetzen?</w:t>
       </w:r>
     </w:p>
-    <w:p>
+    <w:p xmlns:wp14="http://schemas.microsoft.com/office/word/2010/wordml" wp14:textId="77777777">
       <w:pPr>
         <w:pStyle w:val="Erklärung Markierung"/>
       </w:pPr>
@@ -2079,7 +2105,7 @@
         <w:t>schen Sie raus, was nicht zutrifft:</w:t>
       </w:r>
     </w:p>
-    <w:p>
+    <w:p xmlns:wp14="http://schemas.microsoft.com/office/word/2010/wordml" wp14:textId="77777777">
       <w:pPr>
         <w:pStyle w:val="Textbox"/>
         <w:spacing w:before="120"/>
@@ -2093,7 +2119,7 @@
         <w:t>{{PRINCIPLE_3_ANSWER}}</w:t>
       </w:r>
     </w:p>
-    <w:p>
+    <w:p xmlns:wp14="http://schemas.microsoft.com/office/word/2010/wordml" wp14:textId="77777777">
       <w:pPr>
         <w:pStyle w:val="Erklärung Markierung"/>
         <w:spacing w:before="400"/>
@@ -2200,7 +2226,7 @@
         <w:t>nden Sie die Entscheidung und machen Sie bei Punkt 6 weiter.</w:t>
       </w:r>
     </w:p>
-    <w:p>
+    <w:p xmlns:wp14="http://schemas.microsoft.com/office/word/2010/wordml" wp14:textId="77777777">
       <w:pPr>
         <w:pStyle w:val="Textbox Label"/>
         <w:ind w:left="720" w:firstLine="0"/>
@@ -2265,7 +2291,7 @@
         <w:t>gbare Schwerpunkte: {{PRINCIPLE_3_ASPECTS_AVAILABLE}}</w:t>
       </w:r>
     </w:p>
-    <w:p>
+    <w:p xmlns:wp14="http://schemas.microsoft.com/office/word/2010/wordml" wp14:textId="77777777">
       <w:pPr>
         <w:pStyle w:val="Textbox Label"/>
         <w:ind w:left="720" w:firstLine="0"/>
@@ -2295,7 +2321,7 @@
         <w:t>hlte Schwerpunkte</w:t>
       </w:r>
     </w:p>
-    <w:p>
+    <w:p xmlns:wp14="http://schemas.microsoft.com/office/word/2010/wordml" wp14:textId="77777777">
       <w:pPr>
         <w:pStyle w:val="Textbox"/>
         <w:ind w:left="720" w:firstLine="0"/>
@@ -2309,7 +2335,7 @@
         <w:t>{{PRINCIPLE_3_ASPECTS}}</w:t>
       </w:r>
     </w:p>
-    <w:p>
+    <w:p xmlns:wp14="http://schemas.microsoft.com/office/word/2010/wordml" wp14:textId="77777777">
       <w:pPr>
         <w:pStyle w:val="Textbox Label"/>
         <w:ind w:left="720" w:firstLine="0"/>
@@ -2339,7 +2365,7 @@
         <w:t>uterung</w:t>
       </w:r>
     </w:p>
-    <w:p>
+    <w:p xmlns:wp14="http://schemas.microsoft.com/office/word/2010/wordml" wp14:textId="77777777">
       <w:pPr>
         <w:pStyle w:val="Textbox"/>
         <w:ind w:left="720" w:firstLine="0"/>
@@ -2353,7 +2379,7 @@
         <w:t>{{PRINCIPLE_3_REASONING}}</w:t>
       </w:r>
     </w:p>
-    <w:p>
+    <w:p xmlns:wp14="http://schemas.microsoft.com/office/word/2010/wordml" wp14:textId="77777777">
       <w:pPr>
         <w:pStyle w:val="Normal0"/>
         <w:rPr>
@@ -2361,7 +2387,7 @@
         </w:rPr>
       </w:pPr>
     </w:p>
-    <w:p>
+    <w:p xmlns:wp14="http://schemas.microsoft.com/office/word/2010/wordml" wp14:textId="77777777">
       <w:pPr>
         <w:pStyle w:val="Normal0"/>
         <w:rPr>
@@ -2399,7 +2425,7 @@
       </w:r>
       <w:bookmarkEnd w:id="3"/>
     </w:p>
-    <w:p>
+    <w:p xmlns:wp14="http://schemas.microsoft.com/office/word/2010/wordml" wp14:textId="77777777">
       <w:pPr>
         <w:pStyle w:val="Normal0"/>
       </w:pPr>
@@ -2411,7 +2437,7 @@
         <w:t>{{PRINCIPLE_4_DESCRIPTION}}</w:t>
       </w:r>
     </w:p>
-    <w:p>
+    <w:p xmlns:wp14="http://schemas.microsoft.com/office/word/2010/wordml" wp14:textId="77777777">
       <w:pPr>
         <w:pStyle w:val="heading 2"/>
       </w:pPr>
@@ -2437,7 +2463,7 @@
         <w:t>sst sich das Vorhaben im Sinne des Prinzips umsetzen?</w:t>
       </w:r>
     </w:p>
-    <w:p>
+    <w:p xmlns:wp14="http://schemas.microsoft.com/office/word/2010/wordml" wp14:textId="77777777">
       <w:pPr>
         <w:pStyle w:val="Erklärung Markierung"/>
       </w:pPr>
@@ -2463,7 +2489,7 @@
         <w:t>schen Sie raus, was nicht zutrifft:</w:t>
       </w:r>
     </w:p>
-    <w:p>
+    <w:p xmlns:wp14="http://schemas.microsoft.com/office/word/2010/wordml" wp14:textId="77777777">
       <w:pPr>
         <w:pStyle w:val="Textbox"/>
         <w:spacing w:before="120"/>
@@ -2477,7 +2503,7 @@
         <w:t>{{PRINCIPLE_4_ANSWER}}</w:t>
       </w:r>
     </w:p>
-    <w:p>
+    <w:p xmlns:wp14="http://schemas.microsoft.com/office/word/2010/wordml" wp14:textId="77777777">
       <w:pPr>
         <w:pStyle w:val="Erklärung Markierung"/>
         <w:spacing w:before="400"/>
@@ -2584,7 +2610,7 @@
         <w:t>nden Sie die Entscheidung und machen Sie bei Punkt 7 weiter.</w:t>
       </w:r>
     </w:p>
-    <w:p>
+    <w:p xmlns:wp14="http://schemas.microsoft.com/office/word/2010/wordml" wp14:textId="77777777">
       <w:pPr>
         <w:pStyle w:val="Textbox Label"/>
         <w:ind w:left="720" w:firstLine="0"/>
@@ -2649,7 +2675,7 @@
         <w:t>gbare Schwerpunkte: {{PRINCIPLE_4_ASPECTS_AVAILABLE}}</w:t>
       </w:r>
     </w:p>
-    <w:p>
+    <w:p xmlns:wp14="http://schemas.microsoft.com/office/word/2010/wordml" wp14:textId="77777777">
       <w:pPr>
         <w:pStyle w:val="Textbox Label"/>
         <w:ind w:left="720" w:firstLine="0"/>
@@ -2679,7 +2705,7 @@
         <w:t>hlte Schwerpunkte</w:t>
       </w:r>
     </w:p>
-    <w:p>
+    <w:p xmlns:wp14="http://schemas.microsoft.com/office/word/2010/wordml" wp14:textId="77777777">
       <w:pPr>
         <w:pStyle w:val="Textbox"/>
         <w:ind w:left="720" w:firstLine="0"/>
@@ -2693,7 +2719,7 @@
         <w:t>{{PRINCIPLE_4_ASPECTS}}</w:t>
       </w:r>
     </w:p>
-    <w:p>
+    <w:p xmlns:wp14="http://schemas.microsoft.com/office/word/2010/wordml" wp14:textId="77777777">
       <w:pPr>
         <w:pStyle w:val="Textbox Label"/>
         <w:ind w:left="720" w:firstLine="0"/>
@@ -2723,7 +2749,7 @@
         <w:t>uterung</w:t>
       </w:r>
     </w:p>
-    <w:p>
+    <w:p xmlns:wp14="http://schemas.microsoft.com/office/word/2010/wordml" wp14:textId="77777777">
       <w:pPr>
         <w:pStyle w:val="Textbox"/>
         <w:ind w:left="720" w:firstLine="0"/>
@@ -2737,7 +2763,7 @@
         <w:t>{{PRINCIPLE_4_REASONING}}</w:t>
       </w:r>
     </w:p>
-    <w:p>
+    <w:p xmlns:wp14="http://schemas.microsoft.com/office/word/2010/wordml" wp14:textId="77777777">
       <w:pPr>
         <w:pStyle w:val="Normal0"/>
         <w:rPr>
@@ -2785,7 +2811,7 @@
       </w:r>
       <w:bookmarkEnd w:id="4"/>
     </w:p>
-    <w:p>
+    <w:p xmlns:wp14="http://schemas.microsoft.com/office/word/2010/wordml" wp14:textId="77777777">
       <w:pPr>
         <w:pStyle w:val="Normal0"/>
       </w:pPr>
@@ -2797,7 +2823,7 @@
         <w:t>{{PRINCIPLE_5_DESCRIPTION}}</w:t>
       </w:r>
     </w:p>
-    <w:p>
+    <w:p xmlns:wp14="http://schemas.microsoft.com/office/word/2010/wordml" wp14:textId="77777777">
       <w:pPr>
         <w:pStyle w:val="heading 2"/>
       </w:pPr>
@@ -2823,7 +2849,7 @@
         <w:t>sst sich das Vorhaben im Sinne des Prinzips umsetzen?</w:t>
       </w:r>
     </w:p>
-    <w:p>
+    <w:p xmlns:wp14="http://schemas.microsoft.com/office/word/2010/wordml" wp14:textId="77777777">
       <w:pPr>
         <w:pStyle w:val="Erklärung Markierung"/>
       </w:pPr>
@@ -2849,7 +2875,7 @@
         <w:t>schen Sie raus, was nicht zutrifft:</w:t>
       </w:r>
     </w:p>
-    <w:p>
+    <w:p xmlns:wp14="http://schemas.microsoft.com/office/word/2010/wordml" wp14:textId="77777777">
       <w:pPr>
         <w:pStyle w:val="Textbox"/>
         <w:spacing w:before="120"/>
@@ -2863,7 +2889,7 @@
         <w:t>{{PRINCIPLE_5_ANSWER}}</w:t>
       </w:r>
     </w:p>
-    <w:p>
+    <w:p xmlns:wp14="http://schemas.microsoft.com/office/word/2010/wordml" wp14:textId="77777777">
       <w:pPr>
         <w:pStyle w:val="Erklärung Markierung"/>
         <w:spacing w:before="400"/>
@@ -2970,7 +2996,7 @@
         <w:t>nden Sie die Entscheidung.</w:t>
       </w:r>
     </w:p>
-    <w:p>
+    <w:p xmlns:wp14="http://schemas.microsoft.com/office/word/2010/wordml" wp14:textId="77777777">
       <w:pPr>
         <w:pStyle w:val="Textbox Label"/>
         <w:ind w:left="720" w:firstLine="0"/>
@@ -3035,7 +3061,7 @@
         <w:t>gbare Schwerpunkte: {{PRINCIPLE_5_ASPECTS_AVAILABLE}}</w:t>
       </w:r>
     </w:p>
-    <w:p>
+    <w:p xmlns:wp14="http://schemas.microsoft.com/office/word/2010/wordml" wp14:textId="77777777">
       <w:pPr>
         <w:pStyle w:val="Textbox Label"/>
         <w:ind w:left="720" w:firstLine="0"/>
@@ -3065,7 +3091,7 @@
         <w:t>hlte Schwerpunkte</w:t>
       </w:r>
     </w:p>
-    <w:p>
+    <w:p xmlns:wp14="http://schemas.microsoft.com/office/word/2010/wordml" wp14:textId="77777777">
       <w:pPr>
         <w:pStyle w:val="Textbox"/>
         <w:ind w:left="720" w:firstLine="0"/>
@@ -3079,7 +3105,7 @@
         <w:t>{{PRINCIPLE_5_ASPECTS}}</w:t>
       </w:r>
     </w:p>
-    <w:p>
+    <w:p xmlns:wp14="http://schemas.microsoft.com/office/word/2010/wordml" wp14:textId="77777777">
       <w:pPr>
         <w:pStyle w:val="Textbox Label"/>
         <w:ind w:left="720" w:firstLine="0"/>
@@ -3109,7 +3135,7 @@
         <w:t>uterung</w:t>
       </w:r>
     </w:p>
-    <w:p>
+    <w:p xmlns:wp14="http://schemas.microsoft.com/office/word/2010/wordml" wp14:textId="77777777">
       <w:pPr>
         <w:pStyle w:val="Textbox"/>
         <w:ind w:left="720" w:firstLine="0"/>
@@ -3123,7 +3149,7 @@
         <w:t>{{PRINCIPLE_5_REASONING}}</w:t>
       </w:r>
     </w:p>
-    <w:p>
+    <w:p xmlns:wp14="http://schemas.microsoft.com/office/word/2010/wordml" wp14:textId="77777777">
       <w:pPr>
         <w:pStyle w:val="Normal0"/>
         <w:pBdr>
@@ -3134,7 +3160,7 @@
         </w:pBdr>
       </w:pPr>
     </w:p>
-    <w:p>
+    <w:p xmlns:wp14="http://schemas.microsoft.com/office/word/2010/wordml" wp14:textId="77777777">
       <w:pPr>
         <w:pStyle w:val="heading 1"/>
         <w:spacing w:before="720"/>
@@ -3155,7 +3181,7 @@
         <w:t>Das ist jetzt zu tun</w:t>
       </w:r>
     </w:p>
-    <w:p>
+    <w:p xmlns:wp14="http://schemas.microsoft.com/office/word/2010/wordml" wp14:textId="77777777">
       <w:pPr>
         <w:pStyle w:val="List Paragraph"/>
         <w:numPr>
@@ -3199,7 +3225,7 @@
         <w:t>PDF</w:t>
       </w:r>
     </w:p>
-    <w:p>
+    <w:p xmlns:wp14="http://schemas.microsoft.com/office/word/2010/wordml" wp14:textId="77777777">
       <w:pPr>
         <w:pStyle w:val="List Paragraph"/>
         <w:numPr>
@@ -3303,7 +3329,7 @@
         <w:t>cksichtigung der Prinzipien digitaltauglicher Gesetzgebung. Bei Fragen wird der NKR auf Sie zukommen.</w:t>
       </w:r>
     </w:p>
-    <w:p>
+    <w:p xmlns:wp14="http://schemas.microsoft.com/office/word/2010/wordml" wp14:textId="77777777">
       <w:pPr>
         <w:pStyle w:val="List Paragraph"/>
         <w:numPr>
@@ -3395,7 +3421,7 @@
         <w:t>.</w:t>
       </w:r>
     </w:p>
-    <w:p>
+    <w:p xmlns:wp14="http://schemas.microsoft.com/office/word/2010/wordml" wp14:textId="77777777">
       <w:pPr>
         <w:pStyle w:val="List Paragraph"/>
         <w:numPr>
@@ -3445,7 +3471,7 @@
         <w:t>ngen Sie diese formlos als PDF oder als Screenshot an.</w:t>
       </w:r>
     </w:p>
-    <w:p>
+    <w:p xmlns:wp14="http://schemas.microsoft.com/office/word/2010/wordml" wp14:textId="77777777">
       <w:pPr>
         <w:pStyle w:val="List Paragraph"/>
         <w:numPr>
@@ -3485,7 +3511,7 @@
         <w:t>r Sie beendet.</w:t>
       </w:r>
     </w:p>
-    <w:p>
+    <w:p xmlns:wp14="http://schemas.microsoft.com/office/word/2010/wordml" wp14:textId="77777777">
       <w:pPr>
         <w:pStyle w:val="heading 2"/>
       </w:pPr>
@@ -3511,7 +3537,7 @@
         <w:t>ft der Nationale Normenkontrollrat</w:t>
       </w:r>
     </w:p>
-    <w:p>
+    <w:p xmlns:wp14="http://schemas.microsoft.com/office/word/2010/wordml" wp14:textId="77777777">
       <w:pPr>
         <w:pStyle w:val="Normal0"/>
       </w:pPr>
@@ -3635,7 +3661,7 @@
         <w:t>ngt werden. Bei Fragen oder Anregungen kommt Ihre Ansprechperson im NKR-Sekretariat auf Sie zu.</w:t>
       </w:r>
     </w:p>
-    <w:p>
+    <w:p xmlns:wp14="http://schemas.microsoft.com/office/word/2010/wordml" wp14:textId="77777777">
       <w:pPr>
         <w:pStyle w:val="heading 2"/>
       </w:pPr>
@@ -3675,7 +3701,7 @@
         <w:t xml:space="preserve">tzung? </w:t>
       </w:r>
     </w:p>
-    <w:p>
+    <w:p xmlns:wp14="http://schemas.microsoft.com/office/word/2010/wordml" wp14:textId="77777777">
       <w:pPr>
         <w:pStyle w:val="Normal0"/>
       </w:pPr>
@@ -3729,14 +3755,15 @@
       <w:pgSz w:w="11900" w:h="16840" w:orient="portrait"/>
       <w:pgMar w:top="1440" w:right="1440" w:bottom="1440" w:left="1440" w:header="708" w:footer="709"/>
       <w:bidi w:val="0"/>
+      <w:cols w:num="1"/>
     </w:sectPr>
   </w:body>
 </w:document>
 </file>
 
 <file path=word/footer1.xml><?xml version="1.0" encoding="utf-8"?>
-<w:ftr xmlns:r="http://schemas.openxmlformats.org/officeDocument/2006/relationships" xmlns:wp="http://schemas.openxmlformats.org/drawingml/2006/wordprocessingDrawing" xmlns:w="http://schemas.openxmlformats.org/wordprocessingml/2006/main" xmlns:w10="urn:schemas-microsoft-com:office:word" xmlns:w14="http://schemas.microsoft.com/office/word/2010/wordml" xmlns:wps="http://schemas.microsoft.com/office/word/2010/wordprocessingShape" xmlns:wpg="http://schemas.microsoft.com/office/word/2010/wordprocessingGroup" xmlns:mc="http://schemas.openxmlformats.org/markup-compatibility/2006" xmlns:v="urn:schemas-microsoft-com:vml" xmlns:o="urn:schemas-microsoft-com:office:office" xmlns:m="http://schemas.openxmlformats.org/officeDocument/2006/math" mc:Ignorable="w14">
-  <w:p>
+<w:ftr xmlns:wp14="http://schemas.microsoft.com/office/word/2010/wordprocessingDrawing" xmlns:r="http://schemas.openxmlformats.org/officeDocument/2006/relationships" xmlns:wp="http://schemas.openxmlformats.org/drawingml/2006/wordprocessingDrawing" xmlns:w="http://schemas.openxmlformats.org/wordprocessingml/2006/main" xmlns:w10="urn:schemas-microsoft-com:office:word" xmlns:w14="http://schemas.microsoft.com/office/word/2010/wordml" xmlns:wps="http://schemas.microsoft.com/office/word/2010/wordprocessingShape" xmlns:wpg="http://schemas.microsoft.com/office/word/2010/wordprocessingGroup" xmlns:mc="http://schemas.openxmlformats.org/markup-compatibility/2006" xmlns:v="urn:schemas-microsoft-com:vml" xmlns:o="urn:schemas-microsoft-com:office:office" xmlns:m="http://schemas.openxmlformats.org/officeDocument/2006/math" mc:Ignorable="w14 wp14">
+  <w:p xmlns:wp14="http://schemas.microsoft.com/office/word/2010/wordml" wp14:textId="77777777">
     <w:pPr>
       <w:pStyle w:val="Header &amp; Footer"/>
       <w:bidi w:val="0"/>
@@ -3747,8 +3774,8 @@
 </file>
 
 <file path=word/header1.xml><?xml version="1.0" encoding="utf-8"?>
-<w:hdr xmlns:r="http://schemas.openxmlformats.org/officeDocument/2006/relationships" xmlns:wp="http://schemas.openxmlformats.org/drawingml/2006/wordprocessingDrawing" xmlns:w="http://schemas.openxmlformats.org/wordprocessingml/2006/main" xmlns:w10="urn:schemas-microsoft-com:office:word" xmlns:w14="http://schemas.microsoft.com/office/word/2010/wordml" xmlns:wps="http://schemas.microsoft.com/office/word/2010/wordprocessingShape" xmlns:wpg="http://schemas.microsoft.com/office/word/2010/wordprocessingGroup" xmlns:mc="http://schemas.openxmlformats.org/markup-compatibility/2006" xmlns:v="urn:schemas-microsoft-com:vml" xmlns:o="urn:schemas-microsoft-com:office:office" xmlns:m="http://schemas.openxmlformats.org/officeDocument/2006/math" mc:Ignorable="w14">
-  <w:p>
+<w:hdr xmlns:wp14="http://schemas.microsoft.com/office/word/2010/wordprocessingDrawing" xmlns:r="http://schemas.openxmlformats.org/officeDocument/2006/relationships" xmlns:wp="http://schemas.openxmlformats.org/drawingml/2006/wordprocessingDrawing" xmlns:w="http://schemas.openxmlformats.org/wordprocessingml/2006/main" xmlns:w10="urn:schemas-microsoft-com:office:word" xmlns:w14="http://schemas.microsoft.com/office/word/2010/wordml" xmlns:wps="http://schemas.microsoft.com/office/word/2010/wordprocessingShape" xmlns:wpg="http://schemas.microsoft.com/office/word/2010/wordprocessingGroup" xmlns:mc="http://schemas.openxmlformats.org/markup-compatibility/2006" xmlns:v="urn:schemas-microsoft-com:vml" xmlns:o="urn:schemas-microsoft-com:office:office" xmlns:m="http://schemas.openxmlformats.org/officeDocument/2006/math" xmlns:a="http://schemas.openxmlformats.org/drawingml/2006/main" xmlns:pic="http://schemas.openxmlformats.org/drawingml/2006/picture" mc:Ignorable="w14 wp14">
+  <w:p xmlns:wp14="http://schemas.microsoft.com/office/word/2010/wordml" wp14:textId="77777777">
     <w:pPr>
       <w:pStyle w:val="Normal0"/>
       <w:tabs>
@@ -3801,7 +3828,7 @@
       <w:t>Datum: {{TIMESTAMP}}</w:t>
     </w:r>
   </w:p>
-  <w:p>
+  <w:p xmlns:wp14="http://schemas.microsoft.com/office/word/2010/wordml" wp14:textId="77777777">
     <w:pPr>
       <w:pStyle w:val="Normal0"/>
       <w:tabs>
@@ -3816,7 +3843,7 @@
         <w:rStyle w:val="None A"/>
       </w:rPr>
       <w:drawing xmlns:a="http://schemas.openxmlformats.org/drawingml/2006/main">
-        <wp:inline distT="0" distB="0" distL="0" distR="0">
+        <wp:inline xmlns:wp14="http://schemas.microsoft.com/office/word/2010/wordprocessingDrawing" distT="0" distB="0" distL="0" distR="0" wp14:anchorId="403C052C" wp14:editId="7777777">
           <wp:extent cx="1343025" cy="276225"/>
           <wp:effectExtent l="0" t="0" r="0" b="0"/>
           <wp:docPr id="1073741825" name="officeArt object" descr="Logo des Digitalchecks"/>
@@ -3865,6 +3892,7 @@
 <file path=word/numbering.xml><?xml version="1.0" encoding="utf-8"?>
 <w:numbering xmlns:w="http://schemas.openxmlformats.org/wordprocessingml/2006/main" xmlns:wp="http://schemas.openxmlformats.org/drawingml/2006/wordprocessingDrawing" xmlns:w14="http://schemas.microsoft.com/office/word/2010/wordml" xmlns:r="http://schemas.openxmlformats.org/officeDocument/2006/relationships" xmlns:v="urn:schemas-microsoft-com:vml" xmlns:o="urn:schemas-microsoft-com:office:office">
   <w:abstractNum w:abstractNumId="0">
+    <w:nsid w:val="4a39b741"/>
     <w:multiLevelType w:val="hybridMultilevel"/>
     <w:lvl w:ilvl="0">
       <w:start w:val="1"/>
@@ -4102,6 +4130,7 @@
     </w:lvl>
   </w:abstractNum>
   <w:abstractNum w:abstractNumId="1">
+    <w:nsid w:val="223a77dc"/>
     <w:multiLevelType w:val="hybridMultilevel"/>
     <w:lvl w:ilvl="0">
       <w:start w:val="1"/>
@@ -4113,7 +4142,7 @@
         <w:ind w:left="590" w:hanging="590"/>
       </w:pPr>
       <w:rPr>
-        <w:rFonts w:ascii="Times New Roman" w:cs="Times New Roman" w:hAnsi="Times New Roman" w:eastAsia="Times New Roman"/>
+        <w:rFonts w:ascii="Times New Roman" w:hAnsi="Times New Roman" w:eastAsia="Times New Roman" w:cs="Times New Roman"/>
         <w:b w:val="0"/>
         <w:bCs w:val="0"/>
         <w:i w:val="0"/>
@@ -4143,7 +4172,7 @@
         <w:ind w:left="737" w:hanging="283"/>
       </w:pPr>
       <w:rPr>
-        <w:rFonts w:ascii="Symbol" w:cs="Symbol" w:hAnsi="Symbol" w:eastAsia="Symbol"/>
+        <w:rFonts w:ascii="Symbol" w:hAnsi="Symbol" w:eastAsia="Symbol" w:cs="Symbol"/>
         <w:b w:val="0"/>
         <w:bCs w:val="0"/>
         <w:i w:val="0"/>
@@ -4173,7 +4202,7 @@
         <w:ind w:left="1191" w:hanging="283"/>
       </w:pPr>
       <w:rPr>
-        <w:rFonts w:ascii="Symbol" w:cs="Symbol" w:hAnsi="Symbol" w:eastAsia="Symbol"/>
+        <w:rFonts w:ascii="Symbol" w:hAnsi="Symbol" w:eastAsia="Symbol" w:cs="Symbol"/>
         <w:b w:val="0"/>
         <w:bCs w:val="0"/>
         <w:i w:val="0"/>
@@ -4203,7 +4232,7 @@
         <w:ind w:left="1645" w:hanging="283"/>
       </w:pPr>
       <w:rPr>
-        <w:rFonts w:ascii="Symbol" w:cs="Symbol" w:hAnsi="Symbol" w:eastAsia="Symbol"/>
+        <w:rFonts w:ascii="Symbol" w:hAnsi="Symbol" w:eastAsia="Symbol" w:cs="Symbol"/>
         <w:b w:val="0"/>
         <w:bCs w:val="0"/>
         <w:i w:val="0"/>
@@ -4233,7 +4262,7 @@
         <w:ind w:left="2099" w:hanging="283"/>
       </w:pPr>
       <w:rPr>
-        <w:rFonts w:ascii="Symbol" w:cs="Symbol" w:hAnsi="Symbol" w:eastAsia="Symbol"/>
+        <w:rFonts w:ascii="Symbol" w:hAnsi="Symbol" w:eastAsia="Symbol" w:cs="Symbol"/>
         <w:b w:val="0"/>
         <w:bCs w:val="0"/>
         <w:i w:val="0"/>
@@ -4263,7 +4292,7 @@
         <w:ind w:left="2553" w:hanging="283"/>
       </w:pPr>
       <w:rPr>
-        <w:rFonts w:ascii="Symbol" w:cs="Symbol" w:hAnsi="Symbol" w:eastAsia="Symbol"/>
+        <w:rFonts w:ascii="Symbol" w:hAnsi="Symbol" w:eastAsia="Symbol" w:cs="Symbol"/>
         <w:b w:val="0"/>
         <w:bCs w:val="0"/>
         <w:i w:val="0"/>
@@ -4293,7 +4322,7 @@
         <w:ind w:left="3007" w:hanging="283"/>
       </w:pPr>
       <w:rPr>
-        <w:rFonts w:ascii="Symbol" w:cs="Symbol" w:hAnsi="Symbol" w:eastAsia="Symbol"/>
+        <w:rFonts w:ascii="Symbol" w:hAnsi="Symbol" w:eastAsia="Symbol" w:cs="Symbol"/>
         <w:b w:val="0"/>
         <w:bCs w:val="0"/>
         <w:i w:val="0"/>
@@ -4323,7 +4352,7 @@
         <w:ind w:left="3461" w:hanging="283"/>
       </w:pPr>
       <w:rPr>
-        <w:rFonts w:ascii="Symbol" w:cs="Symbol" w:hAnsi="Symbol" w:eastAsia="Symbol"/>
+        <w:rFonts w:ascii="Symbol" w:hAnsi="Symbol" w:eastAsia="Symbol" w:cs="Symbol"/>
         <w:b w:val="0"/>
         <w:bCs w:val="0"/>
         <w:i w:val="0"/>
@@ -4353,7 +4382,7 @@
         <w:ind w:left="3915" w:hanging="283"/>
       </w:pPr>
       <w:rPr>
-        <w:rFonts w:ascii="Symbol" w:cs="Symbol" w:hAnsi="Symbol" w:eastAsia="Symbol"/>
+        <w:rFonts w:ascii="Symbol" w:hAnsi="Symbol" w:eastAsia="Symbol" w:cs="Symbol"/>
         <w:b w:val="0"/>
         <w:bCs w:val="0"/>
         <w:i w:val="0"/>
@@ -4375,10 +4404,12 @@
     </w:lvl>
   </w:abstractNum>
   <w:abstractNum w:abstractNumId="2">
+    <w:nsid w:val="1cbaf58d"/>
     <w:multiLevelType w:val="hybridMultilevel"/>
     <w:numStyleLink w:val="Imported Style 3"/>
   </w:abstractNum>
   <w:abstractNum w:abstractNumId="3">
+    <w:nsid w:val="d6212e0"/>
     <w:multiLevelType w:val="hybridMultilevel"/>
     <w:styleLink w:val="Imported Style 3"/>
     <w:lvl w:ilvl="0">
@@ -4391,7 +4422,7 @@
         <w:ind w:left="360" w:hanging="144"/>
       </w:pPr>
       <w:rPr>
-        <w:rFonts w:ascii="Arial" w:cs="Arial" w:hAnsi="Arial" w:eastAsia="Arial"/>
+        <w:rFonts w:ascii="Arial" w:hAnsi="Arial" w:eastAsia="Arial" w:cs="Arial"/>
         <w:b w:val="0"/>
         <w:bCs w:val="0"/>
         <w:i w:val="0"/>
@@ -4421,7 +4452,7 @@
         <w:ind w:left="864" w:hanging="144"/>
       </w:pPr>
       <w:rPr>
-        <w:rFonts w:ascii="Arial" w:cs="Arial" w:hAnsi="Arial" w:eastAsia="Arial"/>
+        <w:rFonts w:ascii="Arial" w:hAnsi="Arial" w:eastAsia="Arial" w:cs="Arial"/>
         <w:b w:val="0"/>
         <w:bCs w:val="0"/>
         <w:i w:val="0"/>
@@ -4451,7 +4482,7 @@
         <w:ind w:left="1584" w:hanging="144"/>
       </w:pPr>
       <w:rPr>
-        <w:rFonts w:ascii="Arial" w:cs="Arial" w:hAnsi="Arial" w:eastAsia="Arial"/>
+        <w:rFonts w:ascii="Arial" w:hAnsi="Arial" w:eastAsia="Arial" w:cs="Arial"/>
         <w:b w:val="0"/>
         <w:bCs w:val="0"/>
         <w:i w:val="0"/>
@@ -4481,7 +4512,7 @@
         <w:ind w:left="2304" w:hanging="144"/>
       </w:pPr>
       <w:rPr>
-        <w:rFonts w:ascii="Arial" w:cs="Arial" w:hAnsi="Arial" w:eastAsia="Arial"/>
+        <w:rFonts w:ascii="Arial" w:hAnsi="Arial" w:eastAsia="Arial" w:cs="Arial"/>
         <w:b w:val="0"/>
         <w:bCs w:val="0"/>
         <w:i w:val="0"/>
@@ -4511,7 +4542,7 @@
         <w:ind w:left="3024" w:hanging="144"/>
       </w:pPr>
       <w:rPr>
-        <w:rFonts w:ascii="Arial" w:cs="Arial" w:hAnsi="Arial" w:eastAsia="Arial"/>
+        <w:rFonts w:ascii="Arial" w:hAnsi="Arial" w:eastAsia="Arial" w:cs="Arial"/>
         <w:b w:val="0"/>
         <w:bCs w:val="0"/>
         <w:i w:val="0"/>
@@ -4541,7 +4572,7 @@
         <w:ind w:left="3744" w:hanging="144"/>
       </w:pPr>
       <w:rPr>
-        <w:rFonts w:ascii="Arial" w:cs="Arial" w:hAnsi="Arial" w:eastAsia="Arial"/>
+        <w:rFonts w:ascii="Arial" w:hAnsi="Arial" w:eastAsia="Arial" w:cs="Arial"/>
         <w:b w:val="0"/>
         <w:bCs w:val="0"/>
         <w:i w:val="0"/>
@@ -4571,7 +4602,7 @@
         <w:ind w:left="4464" w:hanging="144"/>
       </w:pPr>
       <w:rPr>
-        <w:rFonts w:ascii="Arial" w:cs="Arial" w:hAnsi="Arial" w:eastAsia="Arial"/>
+        <w:rFonts w:ascii="Arial" w:hAnsi="Arial" w:eastAsia="Arial" w:cs="Arial"/>
         <w:b w:val="0"/>
         <w:bCs w:val="0"/>
         <w:i w:val="0"/>
@@ -4601,7 +4632,7 @@
         <w:ind w:left="5184" w:hanging="144"/>
       </w:pPr>
       <w:rPr>
-        <w:rFonts w:ascii="Arial" w:cs="Arial" w:hAnsi="Arial" w:eastAsia="Arial"/>
+        <w:rFonts w:ascii="Arial" w:hAnsi="Arial" w:eastAsia="Arial" w:cs="Arial"/>
         <w:b w:val="0"/>
         <w:bCs w:val="0"/>
         <w:i w:val="0"/>
@@ -4631,7 +4662,7 @@
         <w:ind w:left="5904" w:hanging="144"/>
       </w:pPr>
       <w:rPr>
-        <w:rFonts w:ascii="Arial" w:cs="Arial" w:hAnsi="Arial" w:eastAsia="Arial"/>
+        <w:rFonts w:ascii="Arial" w:hAnsi="Arial" w:eastAsia="Arial" w:cs="Arial"/>
         <w:b w:val="0"/>
         <w:bCs w:val="0"/>
         <w:i w:val="0"/>
@@ -4668,11 +4699,11 @@
 </file>
 
 <file path=word/styles.xml><?xml version="1.0" encoding="utf-8"?>
-<w:styles xmlns:w="http://schemas.openxmlformats.org/wordprocessingml/2006/main" xmlns:mc="http://schemas.openxmlformats.org/markup-compatibility/2006" xmlns:w14="http://schemas.microsoft.com/office/word/2010/wordml" mc:Ignorable="w14">
+<w:styles xmlns:wp14="http://schemas.microsoft.com/office/word/2010/wordprocessingDrawing" xmlns:w="http://schemas.openxmlformats.org/wordprocessingml/2006/main" xmlns:mc="http://schemas.openxmlformats.org/markup-compatibility/2006" xmlns:w14="http://schemas.microsoft.com/office/word/2010/wordml" mc:Ignorable="w14 wp14">
   <w:docDefaults>
     <w:rPrDefault>
       <w:rPr>
-        <w:rFonts w:ascii="Times New Roman" w:cs="Times New Roman" w:hAnsi="Times New Roman" w:eastAsia="Arial Unicode MS"/>
+        <w:rFonts w:ascii="Times New Roman" w:hAnsi="Times New Roman" w:eastAsia="Arial Unicode MS" w:cs="Times New Roman"/>
         <w:b w:val="0"/>
         <w:bCs w:val="0"/>
         <w:i w:val="0"/>
@@ -4703,7 +4734,7 @@
         <w:keepNext w:val="0"/>
         <w:keepLines w:val="0"/>
         <w:pageBreakBefore w:val="0"/>
-        <w:framePr w:anchorLock="0" w:w="0" w:h="0" w:vSpace="0" w:hSpace="0" w:xAlign="left" w:y="0" w:hRule="exact" w:vAnchor="margin"/>
+        <w:framePr w:w="0" w:h="0" w:vSpace="0" w:hSpace="0" w:vAnchor="margin" w:xAlign="left" w:y="0" w:hRule="exact" w:anchorLock="0"/>
         <w:widowControl w:val="1"/>
         <w:numPr>
           <w:ilvl w:val="0"/>
@@ -4727,7 +4758,7 @@
       </w:pPr>
     </w:pPrDefault>
   </w:docDefaults>
-  <w:style w:type="paragraph" w:default="1" w:styleId="Normal">
+  <w:style w:type="paragraph" w:styleId="Normal" w:default="1">
     <w:name w:val="Normal"/>
     <w:next w:val="Normal"/>
     <w:pPr/>
@@ -4737,7 +4768,7 @@
       <w:lang w:val="en-US" w:eastAsia="en-US" w:bidi="ar-SA"/>
     </w:rPr>
   </w:style>
-  <w:style w:type="character" w:default="1" w:styleId="Default Paragraph Font">
+  <w:style w:type="character" w:styleId="Default Paragraph Font" w:default="1">
     <w:name w:val="Default Paragraph Font"/>
     <w:next w:val="Default Paragraph Font"/>
   </w:style>
@@ -4747,7 +4778,7 @@
       <w:u w:val="single"/>
     </w:rPr>
   </w:style>
-  <w:style w:type="table" w:default="1" w:styleId="Table Normal">
+  <w:style w:type="table" w:styleId="Table Normal" w:default="1">
     <w:name w:val="Table Normal"/>
     <w:next w:val="Table Normal"/>
     <w:pPr/>
@@ -4769,7 +4800,7 @@
     <w:tblStylePr w:type="seCell"/>
     <w:tblStylePr w:type="swCell"/>
   </w:style>
-  <w:style w:type="numbering" w:default="1" w:styleId="No List">
+  <w:style w:type="numbering" w:styleId="No List" w:default="1">
     <w:name w:val="No List"/>
     <w:next w:val="No List"/>
     <w:pPr/>
@@ -4791,7 +4822,7 @@
       <w:outlineLvl w:val="9"/>
     </w:pPr>
     <w:rPr>
-      <w:rFonts w:ascii="Arial" w:cs="Arial Unicode MS" w:hAnsi="Arial" w:eastAsia="Arial Unicode MS"/>
+      <w:rFonts w:ascii="Arial" w:hAnsi="Arial" w:eastAsia="Arial Unicode MS" w:cs="Arial Unicode MS"/>
       <w:b w:val="0"/>
       <w:bCs w:val="0"/>
       <w:i w:val="0"/>
@@ -4848,7 +4879,7 @@
       <w:outlineLvl w:val="9"/>
     </w:pPr>
     <w:rPr>
-      <w:rFonts w:ascii="Helvetica Neue" w:cs="Helvetica Neue" w:hAnsi="Helvetica Neue" w:eastAsia="Helvetica Neue"/>
+      <w:rFonts w:ascii="Helvetica Neue" w:hAnsi="Helvetica Neue" w:eastAsia="Helvetica Neue" w:cs="Helvetica Neue"/>
       <w:b w:val="0"/>
       <w:bCs w:val="0"/>
       <w:i w:val="0"/>
@@ -4894,7 +4925,7 @@
       <w:outlineLvl w:val="9"/>
     </w:pPr>
     <w:rPr>
-      <w:rFonts w:ascii="Arial" w:cs="Arial Unicode MS" w:hAnsi="Arial" w:eastAsia="Arial Unicode MS"/>
+      <w:rFonts w:ascii="Arial" w:hAnsi="Arial" w:eastAsia="Arial Unicode MS" w:cs="Arial Unicode MS"/>
       <w:b w:val="0"/>
       <w:bCs w:val="0"/>
       <w:i w:val="0"/>
@@ -4938,7 +4969,7 @@
       <w:outlineLvl w:val="1"/>
     </w:pPr>
     <w:rPr>
-      <w:rFonts w:ascii="Arial" w:cs="Arial Unicode MS" w:hAnsi="Arial" w:eastAsia="Arial Unicode MS"/>
+      <w:rFonts w:ascii="Arial" w:hAnsi="Arial" w:eastAsia="Arial Unicode MS" w:cs="Arial Unicode MS"/>
       <w:b w:val="0"/>
       <w:bCs w:val="0"/>
       <w:i w:val="0"/>
@@ -4982,7 +5013,7 @@
       <w:outlineLvl w:val="9"/>
     </w:pPr>
     <w:rPr>
-      <w:rFonts w:ascii="Arial" w:cs="Arial Unicode MS" w:hAnsi="Arial" w:eastAsia="Arial Unicode MS"/>
+      <w:rFonts w:ascii="Arial" w:hAnsi="Arial" w:eastAsia="Arial Unicode MS" w:cs="Arial Unicode MS"/>
       <w:b w:val="0"/>
       <w:bCs w:val="0"/>
       <w:i w:val="0"/>
@@ -5017,7 +5048,7 @@
     <w:basedOn w:val="None"/>
     <w:next w:val="Hyperlink.0"/>
     <w:rPr>
-      <w:rFonts w:ascii="Arial" w:cs="Arial" w:hAnsi="Arial" w:eastAsia="Arial"/>
+      <w:rFonts w:ascii="Arial" w:hAnsi="Arial" w:eastAsia="Arial" w:cs="Arial"/>
       <w:outline w:val="0"/>
       <w:color w:val="0563c1"/>
       <w:u w:val="single" w:color="0563c1"/>
@@ -5047,7 +5078,7 @@
       <w:outlineLvl w:val="9"/>
     </w:pPr>
     <w:rPr>
-      <w:rFonts w:ascii="Arial" w:cs="Arial Unicode MS" w:hAnsi="Arial" w:eastAsia="Arial Unicode MS"/>
+      <w:rFonts w:ascii="Arial" w:hAnsi="Arial" w:eastAsia="Arial Unicode MS" w:cs="Arial Unicode MS"/>
       <w:b w:val="1"/>
       <w:bCs w:val="1"/>
       <w:i w:val="0"/>
@@ -5091,7 +5122,7 @@
       <w:outlineLvl w:val="0"/>
     </w:pPr>
     <w:rPr>
-      <w:rFonts w:ascii="Arial" w:cs="Arial Unicode MS" w:hAnsi="Arial" w:eastAsia="Arial Unicode MS"/>
+      <w:rFonts w:ascii="Arial" w:hAnsi="Arial" w:eastAsia="Arial Unicode MS" w:cs="Arial Unicode MS"/>
       <w:b w:val="0"/>
       <w:bCs w:val="0"/>
       <w:i w:val="0"/>
@@ -5141,7 +5172,7 @@
       <w:outlineLvl w:val="9"/>
     </w:pPr>
     <w:rPr>
-      <w:rFonts w:ascii="Arial" w:cs="Arial Unicode MS" w:hAnsi="Arial" w:eastAsia="Arial Unicode MS"/>
+      <w:rFonts w:ascii="Arial" w:hAnsi="Arial" w:eastAsia="Arial Unicode MS" w:cs="Arial Unicode MS"/>
       <w:b w:val="0"/>
       <w:bCs w:val="0"/>
       <w:i w:val="0"/>
@@ -5185,7 +5216,7 @@
       <w:outlineLvl w:val="9"/>
     </w:pPr>
     <w:rPr>
-      <w:rFonts w:ascii="Arial" w:cs="Arial Unicode MS" w:hAnsi="Arial" w:eastAsia="Arial Unicode MS"/>
+      <w:rFonts w:ascii="Arial" w:hAnsi="Arial" w:eastAsia="Arial Unicode MS" w:cs="Arial Unicode MS"/>
       <w:b w:val="0"/>
       <w:bCs w:val="0"/>
       <w:i w:val="0"/>
@@ -5229,7 +5260,7 @@
       <w:outlineLvl w:val="9"/>
     </w:pPr>
     <w:rPr>
-      <w:rFonts w:ascii="Arial" w:cs="Arial Unicode MS" w:hAnsi="Arial" w:eastAsia="Arial Unicode MS"/>
+      <w:rFonts w:ascii="Arial" w:hAnsi="Arial" w:eastAsia="Arial Unicode MS" w:cs="Arial Unicode MS"/>
       <w:b w:val="0"/>
       <w:bCs w:val="0"/>
       <w:i w:val="0"/>
@@ -5504,7 +5535,7 @@
           <a:buFontTx/>
           <a:buNone/>
           <a:tabLst/>
-          <a:defRPr b="0" baseline="0" cap="none" i="0" spc="0" strike="noStrike" sz="1800" u="none" kumimoji="0" normalizeH="0">
+          <a:defRPr kumimoji="0" sz="1800" b="0" i="0" u="none" strike="noStrike" cap="none" spc="0" normalizeH="0" baseline="0">
             <a:ln>
               <a:noFill/>
             </a:ln>
@@ -5534,7 +5565,7 @@
           <a:buFontTx/>
           <a:buNone/>
           <a:tabLst/>
-          <a:defRPr b="0" baseline="0" cap="none" i="0" spc="0" strike="noStrike" sz="1800" u="none" kumimoji="0" normalizeH="0">
+          <a:defRPr kumimoji="0" sz="1800" b="0" i="0" u="none" strike="noStrike" cap="none" spc="0" normalizeH="0" baseline="0">
             <a:ln>
               <a:noFill/>
             </a:ln>
@@ -5560,7 +5591,7 @@
           <a:buFontTx/>
           <a:buNone/>
           <a:tabLst/>
-          <a:defRPr b="0" baseline="0" cap="none" i="0" spc="0" strike="noStrike" sz="1800" u="none" kumimoji="0" normalizeH="0">
+          <a:defRPr kumimoji="0" sz="1800" b="0" i="0" u="none" strike="noStrike" cap="none" spc="0" normalizeH="0" baseline="0">
             <a:ln>
               <a:noFill/>
             </a:ln>
@@ -5586,7 +5617,7 @@
           <a:buFontTx/>
           <a:buNone/>
           <a:tabLst/>
-          <a:defRPr b="0" baseline="0" cap="none" i="0" spc="0" strike="noStrike" sz="1800" u="none" kumimoji="0" normalizeH="0">
+          <a:defRPr kumimoji="0" sz="1800" b="0" i="0" u="none" strike="noStrike" cap="none" spc="0" normalizeH="0" baseline="0">
             <a:ln>
               <a:noFill/>
             </a:ln>
@@ -5612,7 +5643,7 @@
           <a:buFontTx/>
           <a:buNone/>
           <a:tabLst/>
-          <a:defRPr b="0" baseline="0" cap="none" i="0" spc="0" strike="noStrike" sz="1800" u="none" kumimoji="0" normalizeH="0">
+          <a:defRPr kumimoji="0" sz="1800" b="0" i="0" u="none" strike="noStrike" cap="none" spc="0" normalizeH="0" baseline="0">
             <a:ln>
               <a:noFill/>
             </a:ln>
@@ -5638,7 +5669,7 @@
           <a:buFontTx/>
           <a:buNone/>
           <a:tabLst/>
-          <a:defRPr b="0" baseline="0" cap="none" i="0" spc="0" strike="noStrike" sz="1800" u="none" kumimoji="0" normalizeH="0">
+          <a:defRPr kumimoji="0" sz="1800" b="0" i="0" u="none" strike="noStrike" cap="none" spc="0" normalizeH="0" baseline="0">
             <a:ln>
               <a:noFill/>
             </a:ln>
@@ -5664,7 +5695,7 @@
           <a:buFontTx/>
           <a:buNone/>
           <a:tabLst/>
-          <a:defRPr b="0" baseline="0" cap="none" i="0" spc="0" strike="noStrike" sz="1800" u="none" kumimoji="0" normalizeH="0">
+          <a:defRPr kumimoji="0" sz="1800" b="0" i="0" u="none" strike="noStrike" cap="none" spc="0" normalizeH="0" baseline="0">
             <a:ln>
               <a:noFill/>
             </a:ln>
@@ -5690,7 +5721,7 @@
           <a:buFontTx/>
           <a:buNone/>
           <a:tabLst/>
-          <a:defRPr b="0" baseline="0" cap="none" i="0" spc="0" strike="noStrike" sz="1800" u="none" kumimoji="0" normalizeH="0">
+          <a:defRPr kumimoji="0" sz="1800" b="0" i="0" u="none" strike="noStrike" cap="none" spc="0" normalizeH="0" baseline="0">
             <a:ln>
               <a:noFill/>
             </a:ln>
@@ -5716,7 +5747,7 @@
           <a:buFontTx/>
           <a:buNone/>
           <a:tabLst/>
-          <a:defRPr b="0" baseline="0" cap="none" i="0" spc="0" strike="noStrike" sz="1800" u="none" kumimoji="0" normalizeH="0">
+          <a:defRPr kumimoji="0" sz="1800" b="0" i="0" u="none" strike="noStrike" cap="none" spc="0" normalizeH="0" baseline="0">
             <a:ln>
               <a:noFill/>
             </a:ln>
@@ -5742,7 +5773,7 @@
           <a:buFontTx/>
           <a:buNone/>
           <a:tabLst/>
-          <a:defRPr b="0" baseline="0" cap="none" i="0" spc="0" strike="noStrike" sz="1800" u="none" kumimoji="0" normalizeH="0">
+          <a:defRPr kumimoji="0" sz="1800" b="0" i="0" u="none" strike="noStrike" cap="none" spc="0" normalizeH="0" baseline="0">
             <a:ln>
               <a:noFill/>
             </a:ln>
@@ -5793,7 +5824,7 @@
           <a:buFontTx/>
           <a:buNone/>
           <a:tabLst/>
-          <a:defRPr b="0" baseline="0" cap="none" i="0" spc="0" strike="noStrike" sz="1800" u="none" kumimoji="0" normalizeH="0">
+          <a:defRPr kumimoji="0" sz="1800" b="0" i="0" u="none" strike="noStrike" cap="none" spc="0" normalizeH="0" baseline="0">
             <a:ln>
               <a:noFill/>
             </a:ln>
@@ -5819,7 +5850,7 @@
           <a:buFontTx/>
           <a:buNone/>
           <a:tabLst/>
-          <a:defRPr b="0" baseline="0" cap="none" i="0" spc="0" strike="noStrike" sz="1800" u="none" kumimoji="0" normalizeH="0">
+          <a:defRPr kumimoji="0" sz="1800" b="0" i="0" u="none" strike="noStrike" cap="none" spc="0" normalizeH="0" baseline="0">
             <a:ln>
               <a:noFill/>
             </a:ln>
@@ -5845,7 +5876,7 @@
           <a:buFontTx/>
           <a:buNone/>
           <a:tabLst/>
-          <a:defRPr b="0" baseline="0" cap="none" i="0" spc="0" strike="noStrike" sz="1800" u="none" kumimoji="0" normalizeH="0">
+          <a:defRPr kumimoji="0" sz="1800" b="0" i="0" u="none" strike="noStrike" cap="none" spc="0" normalizeH="0" baseline="0">
             <a:ln>
               <a:noFill/>
             </a:ln>
@@ -5871,7 +5902,7 @@
           <a:buFontTx/>
           <a:buNone/>
           <a:tabLst/>
-          <a:defRPr b="0" baseline="0" cap="none" i="0" spc="0" strike="noStrike" sz="1800" u="none" kumimoji="0" normalizeH="0">
+          <a:defRPr kumimoji="0" sz="1800" b="0" i="0" u="none" strike="noStrike" cap="none" spc="0" normalizeH="0" baseline="0">
             <a:ln>
               <a:noFill/>
             </a:ln>
@@ -5897,7 +5928,7 @@
           <a:buFontTx/>
           <a:buNone/>
           <a:tabLst/>
-          <a:defRPr b="0" baseline="0" cap="none" i="0" spc="0" strike="noStrike" sz="1800" u="none" kumimoji="0" normalizeH="0">
+          <a:defRPr kumimoji="0" sz="1800" b="0" i="0" u="none" strike="noStrike" cap="none" spc="0" normalizeH="0" baseline="0">
             <a:ln>
               <a:noFill/>
             </a:ln>
@@ -5923,7 +5954,7 @@
           <a:buFontTx/>
           <a:buNone/>
           <a:tabLst/>
-          <a:defRPr b="0" baseline="0" cap="none" i="0" spc="0" strike="noStrike" sz="1800" u="none" kumimoji="0" normalizeH="0">
+          <a:defRPr kumimoji="0" sz="1800" b="0" i="0" u="none" strike="noStrike" cap="none" spc="0" normalizeH="0" baseline="0">
             <a:ln>
               <a:noFill/>
             </a:ln>
@@ -5949,7 +5980,7 @@
           <a:buFontTx/>
           <a:buNone/>
           <a:tabLst/>
-          <a:defRPr b="0" baseline="0" cap="none" i="0" spc="0" strike="noStrike" sz="1800" u="none" kumimoji="0" normalizeH="0">
+          <a:defRPr kumimoji="0" sz="1800" b="0" i="0" u="none" strike="noStrike" cap="none" spc="0" normalizeH="0" baseline="0">
             <a:ln>
               <a:noFill/>
             </a:ln>
@@ -5975,7 +6006,7 @@
           <a:buFontTx/>
           <a:buNone/>
           <a:tabLst/>
-          <a:defRPr b="0" baseline="0" cap="none" i="0" spc="0" strike="noStrike" sz="1800" u="none" kumimoji="0" normalizeH="0">
+          <a:defRPr kumimoji="0" sz="1800" b="0" i="0" u="none" strike="noStrike" cap="none" spc="0" normalizeH="0" baseline="0">
             <a:ln>
               <a:noFill/>
             </a:ln>
@@ -6001,7 +6032,7 @@
           <a:buFontTx/>
           <a:buNone/>
           <a:tabLst/>
-          <a:defRPr b="0" baseline="0" cap="none" i="0" spc="0" strike="noStrike" sz="1800" u="none" kumimoji="0" normalizeH="0">
+          <a:defRPr kumimoji="0" sz="1800" b="0" i="0" u="none" strike="noStrike" cap="none" spc="0" normalizeH="0" baseline="0">
             <a:ln>
               <a:noFill/>
             </a:ln>
@@ -6027,7 +6058,7 @@
           <a:buFontTx/>
           <a:buNone/>
           <a:tabLst/>
-          <a:defRPr b="0" baseline="0" cap="none" i="0" spc="0" strike="noStrike" sz="1800" u="none" kumimoji="0" normalizeH="0">
+          <a:defRPr kumimoji="0" sz="1800" b="0" i="0" u="none" strike="noStrike" cap="none" spc="0" normalizeH="0" baseline="0">
             <a:ln>
               <a:noFill/>
             </a:ln>
@@ -6075,7 +6106,7 @@
           <a:buFontTx/>
           <a:buNone/>
           <a:tabLst/>
-          <a:defRPr b="0" baseline="0" cap="none" i="0" spc="0" strike="noStrike" sz="1800" u="none" kumimoji="0" normalizeH="0">
+          <a:defRPr kumimoji="0" sz="1800" b="0" i="0" u="none" strike="noStrike" cap="none" spc="0" normalizeH="0" baseline="0">
             <a:ln>
               <a:noFill/>
             </a:ln>
@@ -6105,7 +6136,7 @@
           <a:buFontTx/>
           <a:buNone/>
           <a:tabLst/>
-          <a:defRPr b="0" baseline="0" cap="none" i="0" spc="0" strike="noStrike" sz="1800" u="none" kumimoji="0" normalizeH="0">
+          <a:defRPr kumimoji="0" sz="1800" b="0" i="0" u="none" strike="noStrike" cap="none" spc="0" normalizeH="0" baseline="0">
             <a:ln>
               <a:noFill/>
             </a:ln>
@@ -6131,7 +6162,7 @@
           <a:buFontTx/>
           <a:buNone/>
           <a:tabLst/>
-          <a:defRPr b="0" baseline="0" cap="none" i="0" spc="0" strike="noStrike" sz="1800" u="none" kumimoji="0" normalizeH="0">
+          <a:defRPr kumimoji="0" sz="1800" b="0" i="0" u="none" strike="noStrike" cap="none" spc="0" normalizeH="0" baseline="0">
             <a:ln>
               <a:noFill/>
             </a:ln>
@@ -6157,7 +6188,7 @@
           <a:buFontTx/>
           <a:buNone/>
           <a:tabLst/>
-          <a:defRPr b="0" baseline="0" cap="none" i="0" spc="0" strike="noStrike" sz="1800" u="none" kumimoji="0" normalizeH="0">
+          <a:defRPr kumimoji="0" sz="1800" b="0" i="0" u="none" strike="noStrike" cap="none" spc="0" normalizeH="0" baseline="0">
             <a:ln>
               <a:noFill/>
             </a:ln>
@@ -6183,7 +6214,7 @@
           <a:buFontTx/>
           <a:buNone/>
           <a:tabLst/>
-          <a:defRPr b="0" baseline="0" cap="none" i="0" spc="0" strike="noStrike" sz="1800" u="none" kumimoji="0" normalizeH="0">
+          <a:defRPr kumimoji="0" sz="1800" b="0" i="0" u="none" strike="noStrike" cap="none" spc="0" normalizeH="0" baseline="0">
             <a:ln>
               <a:noFill/>
             </a:ln>
@@ -6209,7 +6240,7 @@
           <a:buFontTx/>
           <a:buNone/>
           <a:tabLst/>
-          <a:defRPr b="0" baseline="0" cap="none" i="0" spc="0" strike="noStrike" sz="1800" u="none" kumimoji="0" normalizeH="0">
+          <a:defRPr kumimoji="0" sz="1800" b="0" i="0" u="none" strike="noStrike" cap="none" spc="0" normalizeH="0" baseline="0">
             <a:ln>
               <a:noFill/>
             </a:ln>
@@ -6235,7 +6266,7 @@
           <a:buFontTx/>
           <a:buNone/>
           <a:tabLst/>
-          <a:defRPr b="0" baseline="0" cap="none" i="0" spc="0" strike="noStrike" sz="1800" u="none" kumimoji="0" normalizeH="0">
+          <a:defRPr kumimoji="0" sz="1800" b="0" i="0" u="none" strike="noStrike" cap="none" spc="0" normalizeH="0" baseline="0">
             <a:ln>
               <a:noFill/>
             </a:ln>
@@ -6261,7 +6292,7 @@
           <a:buFontTx/>
           <a:buNone/>
           <a:tabLst/>
-          <a:defRPr b="0" baseline="0" cap="none" i="0" spc="0" strike="noStrike" sz="1800" u="none" kumimoji="0" normalizeH="0">
+          <a:defRPr kumimoji="0" sz="1800" b="0" i="0" u="none" strike="noStrike" cap="none" spc="0" normalizeH="0" baseline="0">
             <a:ln>
               <a:noFill/>
             </a:ln>
@@ -6287,7 +6318,7 @@
           <a:buFontTx/>
           <a:buNone/>
           <a:tabLst/>
-          <a:defRPr b="0" baseline="0" cap="none" i="0" spc="0" strike="noStrike" sz="1800" u="none" kumimoji="0" normalizeH="0">
+          <a:defRPr kumimoji="0" sz="1800" b="0" i="0" u="none" strike="noStrike" cap="none" spc="0" normalizeH="0" baseline="0">
             <a:ln>
               <a:noFill/>
             </a:ln>
@@ -6313,7 +6344,7 @@
           <a:buFontTx/>
           <a:buNone/>
           <a:tabLst/>
-          <a:defRPr b="0" baseline="0" cap="none" i="0" spc="0" strike="noStrike" sz="1800" u="none" kumimoji="0" normalizeH="0">
+          <a:defRPr kumimoji="0" sz="1800" b="0" i="0" u="none" strike="noStrike" cap="none" spc="0" normalizeH="0" baseline="0">
             <a:ln>
               <a:noFill/>
             </a:ln>

</xml_diff>